<commit_message>
docs(qms): AI impact assessment EM26-35 and response to audit finding 6 (OFI 6.1.1)
Surveillance audit 2026-10-14, finding 6: no evidence of an AI impact
assessment during development. Issued 2026-10-20 for approval:

- EM26-35 AI Impact Assessment: 15 impact areas (privacy, consent,
  accuracy, over-reliance, bias, transparency, human oversight, security,
  isolation, licences, generated content, environment, accessibility,
  governance, new sectors), 13 use cases screened, actions AIA-01..09
- SOP-05 rev 1.2: §7a AI impact assessment, stage 1a, §5.6, §10 record
- REG-03: R-15 recording consent, R-16 bias, R-17 over-reliance,
  R-18 new sectors; O-05
- REG-04 Section D: OFI-2026-06
- Response for findings sheet columns J-M (docx + paste-ready xlsx)
- REG-01, evidence README, QMS Word copies updated

Co-Authored-By: Claude Opus 5.5 <noreply@anthropic.com>
</commit_message>
<xml_diff>
--- a/docs/qms/evidence-2026/QMS_Word/procedures__SOP-05_Design_and_Development_Control.docx
+++ b/docs/qms/evidence-2026/QMS_Word/procedures__SOP-05_Design_and_Development_Control.docx
@@ -29,8 +29,8 @@
         </w:tblCellMar>
       </w:tblPr>
       <w:tblGrid>
-        <w:gridCol w:w="1445"/>
-        <w:gridCol w:w="3762"/>
+        <w:gridCol w:w="1247"/>
+        <w:gridCol w:w="3960"/>
       </w:tblGrid>
       <w:tr>
         <w:trPr>
@@ -38,7 +38,7 @@
         </w:trPr>
         <w:tc>
           <w:tcPr>
-            <w:tcW w:w="1445" w:type="dxa"/>
+            <w:tcW w:w="1247" w:type="dxa"/>
             <w:tcBorders>
               <w:top w:val="single" w:sz="6" w:space="0" w:color="BFC7D5"/>
               <w:left w:val="single" w:sz="6" w:space="0" w:color="BFC7D5"/>
@@ -68,7 +68,7 @@
         </w:tc>
         <w:tc>
           <w:tcPr>
-            <w:tcW w:w="3762" w:type="dxa"/>
+            <w:tcW w:w="3960" w:type="dxa"/>
             <w:tcBorders>
               <w:top w:val="single" w:sz="6" w:space="0" w:color="BFC7D5"/>
               <w:left w:val="single" w:sz="2" w:space="0" w:color="BFC7D5"/>
@@ -101,7 +101,7 @@
         <w:trPr/>
         <w:tc>
           <w:tcPr>
-            <w:tcW w:w="1445" w:type="dxa"/>
+            <w:tcW w:w="1247" w:type="dxa"/>
             <w:tcBorders>
               <w:left w:val="single" w:sz="6" w:space="0" w:color="BFC7D5"/>
               <w:bottom w:val="single" w:sz="2" w:space="0" w:color="BFC7D5"/>
@@ -125,7 +125,7 @@
         </w:tc>
         <w:tc>
           <w:tcPr>
-            <w:tcW w:w="3762" w:type="dxa"/>
+            <w:tcW w:w="3960" w:type="dxa"/>
             <w:tcBorders>
               <w:left w:val="single" w:sz="2" w:space="0" w:color="BFC7D5"/>
               <w:bottom w:val="single" w:sz="2" w:space="0" w:color="BFC7D5"/>
@@ -152,7 +152,7 @@
         <w:trPr/>
         <w:tc>
           <w:tcPr>
-            <w:tcW w:w="1445" w:type="dxa"/>
+            <w:tcW w:w="1247" w:type="dxa"/>
             <w:tcBorders>
               <w:left w:val="single" w:sz="6" w:space="0" w:color="BFC7D5"/>
               <w:bottom w:val="single" w:sz="2" w:space="0" w:color="BFC7D5"/>
@@ -176,25 +176,25 @@
         </w:tc>
         <w:tc>
           <w:tcPr>
-            <w:tcW w:w="3762" w:type="dxa"/>
-            <w:tcBorders>
-              <w:left w:val="single" w:sz="2" w:space="0" w:color="BFC7D5"/>
-              <w:bottom w:val="single" w:sz="2" w:space="0" w:color="BFC7D5"/>
-              <w:right w:val="single" w:sz="6" w:space="0" w:color="BFC7D5"/>
-            </w:tcBorders>
-            <w:vAlign w:val="center"/>
-          </w:tcPr>
-          <w:p>
-            <w:pPr>
-              <w:pStyle w:val="TableContents"/>
-              <w:bidi w:val="0"/>
-              <w:spacing w:before="0" w:after="283"/>
-              <w:jc w:val="left"/>
-              <w:rPr/>
-            </w:pPr>
-            <w:r>
-              <w:rPr/>
-              <w:t>1.1</w:t>
+            <w:tcW w:w="3960" w:type="dxa"/>
+            <w:tcBorders>
+              <w:left w:val="single" w:sz="2" w:space="0" w:color="BFC7D5"/>
+              <w:bottom w:val="single" w:sz="2" w:space="0" w:color="BFC7D5"/>
+              <w:right w:val="single" w:sz="6" w:space="0" w:color="BFC7D5"/>
+            </w:tcBorders>
+            <w:vAlign w:val="center"/>
+          </w:tcPr>
+          <w:p>
+            <w:pPr>
+              <w:pStyle w:val="TableContents"/>
+              <w:bidi w:val="0"/>
+              <w:spacing w:before="0" w:after="283"/>
+              <w:jc w:val="left"/>
+              <w:rPr/>
+            </w:pPr>
+            <w:r>
+              <w:rPr/>
+              <w:t>1.2</w:t>
             </w:r>
           </w:p>
         </w:tc>
@@ -203,7 +203,7 @@
         <w:trPr/>
         <w:tc>
           <w:tcPr>
-            <w:tcW w:w="1445" w:type="dxa"/>
+            <w:tcW w:w="1247" w:type="dxa"/>
             <w:tcBorders>
               <w:left w:val="single" w:sz="6" w:space="0" w:color="BFC7D5"/>
               <w:bottom w:val="single" w:sz="2" w:space="0" w:color="BFC7D5"/>
@@ -227,7 +227,7 @@
         </w:tc>
         <w:tc>
           <w:tcPr>
-            <w:tcW w:w="3762" w:type="dxa"/>
+            <w:tcW w:w="3960" w:type="dxa"/>
             <w:tcBorders>
               <w:left w:val="single" w:sz="2" w:space="0" w:color="BFC7D5"/>
               <w:bottom w:val="single" w:sz="2" w:space="0" w:color="BFC7D5"/>
@@ -247,7 +247,11 @@
               <w:rPr>
                 <w:rStyle w:val="Strong"/>
               </w:rPr>
-              <w:t>APPROVED</w:t>
+              <w:t>ISSUED FOR APPROVAL</w:t>
+            </w:r>
+            <w:r>
+              <w:rPr/>
+              <w:t xml:space="preserve"> — revision 1.2 (2026-10-20). Revision 1.1 APPROVED 2026-10-07 (AR-2026-001) remains in force until 1.2 is approved</w:t>
             </w:r>
           </w:p>
         </w:tc>
@@ -256,7 +260,7 @@
         <w:trPr/>
         <w:tc>
           <w:tcPr>
-            <w:tcW w:w="1445" w:type="dxa"/>
+            <w:tcW w:w="1247" w:type="dxa"/>
             <w:tcBorders>
               <w:left w:val="single" w:sz="6" w:space="0" w:color="BFC7D5"/>
               <w:bottom w:val="single" w:sz="2" w:space="0" w:color="BFC7D5"/>
@@ -280,7 +284,7 @@
         </w:tc>
         <w:tc>
           <w:tcPr>
-            <w:tcW w:w="3762" w:type="dxa"/>
+            <w:tcW w:w="3960" w:type="dxa"/>
             <w:tcBorders>
               <w:left w:val="single" w:sz="2" w:space="0" w:color="BFC7D5"/>
               <w:bottom w:val="single" w:sz="2" w:space="0" w:color="BFC7D5"/>
@@ -307,7 +311,7 @@
         <w:trPr/>
         <w:tc>
           <w:tcPr>
-            <w:tcW w:w="1445" w:type="dxa"/>
+            <w:tcW w:w="1247" w:type="dxa"/>
             <w:tcBorders>
               <w:left w:val="single" w:sz="6" w:space="0" w:color="BFC7D5"/>
               <w:bottom w:val="single" w:sz="2" w:space="0" w:color="BFC7D5"/>
@@ -331,7 +335,7 @@
         </w:tc>
         <w:tc>
           <w:tcPr>
-            <w:tcW w:w="3762" w:type="dxa"/>
+            <w:tcW w:w="3960" w:type="dxa"/>
             <w:tcBorders>
               <w:left w:val="single" w:sz="2" w:space="0" w:color="BFC7D5"/>
               <w:bottom w:val="single" w:sz="2" w:space="0" w:color="BFC7D5"/>
@@ -358,7 +362,7 @@
         <w:trPr/>
         <w:tc>
           <w:tcPr>
-            <w:tcW w:w="1445" w:type="dxa"/>
+            <w:tcW w:w="1247" w:type="dxa"/>
             <w:tcBorders>
               <w:left w:val="single" w:sz="6" w:space="0" w:color="BFC7D5"/>
               <w:bottom w:val="single" w:sz="2" w:space="0" w:color="BFC7D5"/>
@@ -382,25 +386,25 @@
         </w:tc>
         <w:tc>
           <w:tcPr>
-            <w:tcW w:w="3762" w:type="dxa"/>
-            <w:tcBorders>
-              <w:left w:val="single" w:sz="2" w:space="0" w:color="BFC7D5"/>
-              <w:bottom w:val="single" w:sz="2" w:space="0" w:color="BFC7D5"/>
-              <w:right w:val="single" w:sz="6" w:space="0" w:color="BFC7D5"/>
-            </w:tcBorders>
-            <w:vAlign w:val="center"/>
-          </w:tcPr>
-          <w:p>
-            <w:pPr>
-              <w:pStyle w:val="TableContents"/>
-              <w:bidi w:val="0"/>
-              <w:spacing w:before="0" w:after="283"/>
-              <w:jc w:val="left"/>
-              <w:rPr/>
-            </w:pPr>
-            <w:r>
-              <w:rPr/>
-              <w:t>2026-10-07</w:t>
+            <w:tcW w:w="3960" w:type="dxa"/>
+            <w:tcBorders>
+              <w:left w:val="single" w:sz="2" w:space="0" w:color="BFC7D5"/>
+              <w:bottom w:val="single" w:sz="2" w:space="0" w:color="BFC7D5"/>
+              <w:right w:val="single" w:sz="6" w:space="0" w:color="BFC7D5"/>
+            </w:tcBorders>
+            <w:vAlign w:val="center"/>
+          </w:tcPr>
+          <w:p>
+            <w:pPr>
+              <w:pStyle w:val="TableContents"/>
+              <w:bidi w:val="0"/>
+              <w:spacing w:before="0" w:after="283"/>
+              <w:jc w:val="left"/>
+              <w:rPr/>
+            </w:pPr>
+            <w:r>
+              <w:rPr/>
+              <w:t>2026-10-07 (revision 1.1) — revision 1.2 pending</w:t>
             </w:r>
           </w:p>
         </w:tc>
@@ -409,7 +413,7 @@
         <w:trPr/>
         <w:tc>
           <w:tcPr>
-            <w:tcW w:w="1445" w:type="dxa"/>
+            <w:tcW w:w="1247" w:type="dxa"/>
             <w:tcBorders>
               <w:left w:val="single" w:sz="6" w:space="0" w:color="BFC7D5"/>
               <w:bottom w:val="single" w:sz="2" w:space="0" w:color="BFC7D5"/>
@@ -433,7 +437,7 @@
         </w:tc>
         <w:tc>
           <w:tcPr>
-            <w:tcW w:w="3762" w:type="dxa"/>
+            <w:tcW w:w="3960" w:type="dxa"/>
             <w:tcBorders>
               <w:left w:val="single" w:sz="2" w:space="0" w:color="BFC7D5"/>
               <w:bottom w:val="single" w:sz="2" w:space="0" w:color="BFC7D5"/>
@@ -460,7 +464,7 @@
         <w:trPr/>
         <w:tc>
           <w:tcPr>
-            <w:tcW w:w="1445" w:type="dxa"/>
+            <w:tcW w:w="1247" w:type="dxa"/>
             <w:tcBorders>
               <w:left w:val="single" w:sz="6" w:space="0" w:color="BFC7D5"/>
               <w:bottom w:val="single" w:sz="2" w:space="0" w:color="BFC7D5"/>
@@ -484,25 +488,25 @@
         </w:tc>
         <w:tc>
           <w:tcPr>
-            <w:tcW w:w="3762" w:type="dxa"/>
-            <w:tcBorders>
-              <w:left w:val="single" w:sz="2" w:space="0" w:color="BFC7D5"/>
-              <w:bottom w:val="single" w:sz="2" w:space="0" w:color="BFC7D5"/>
-              <w:right w:val="single" w:sz="6" w:space="0" w:color="BFC7D5"/>
-            </w:tcBorders>
-            <w:vAlign w:val="center"/>
-          </w:tcPr>
-          <w:p>
-            <w:pPr>
-              <w:pStyle w:val="TableContents"/>
-              <w:bidi w:val="0"/>
-              <w:spacing w:before="0" w:after="283"/>
-              <w:jc w:val="left"/>
-              <w:rPr/>
-            </w:pPr>
-            <w:r>
-              <w:rPr/>
-              <w:t>Richard Watson Stephen Amudha (Lead Engineer) — 2026-10-07</w:t>
+            <w:tcW w:w="3960" w:type="dxa"/>
+            <w:tcBorders>
+              <w:left w:val="single" w:sz="2" w:space="0" w:color="BFC7D5"/>
+              <w:bottom w:val="single" w:sz="2" w:space="0" w:color="BFC7D5"/>
+              <w:right w:val="single" w:sz="6" w:space="0" w:color="BFC7D5"/>
+            </w:tcBorders>
+            <w:vAlign w:val="center"/>
+          </w:tcPr>
+          <w:p>
+            <w:pPr>
+              <w:pStyle w:val="TableContents"/>
+              <w:bidi w:val="0"/>
+              <w:spacing w:before="0" w:after="283"/>
+              <w:jc w:val="left"/>
+              <w:rPr/>
+            </w:pPr>
+            <w:r>
+              <w:rPr/>
+              <w:t>Richard Watson Stephen Amudha (Lead Engineer) — 2026-10-07; revision 1.2 — 2026-10-20</w:t>
             </w:r>
           </w:p>
         </w:tc>
@@ -511,7 +515,7 @@
         <w:trPr/>
         <w:tc>
           <w:tcPr>
-            <w:tcW w:w="1445" w:type="dxa"/>
+            <w:tcW w:w="1247" w:type="dxa"/>
             <w:tcBorders>
               <w:left w:val="single" w:sz="6" w:space="0" w:color="BFC7D5"/>
               <w:bottom w:val="single" w:sz="2" w:space="0" w:color="BFC7D5"/>
@@ -535,25 +539,25 @@
         </w:tc>
         <w:tc>
           <w:tcPr>
-            <w:tcW w:w="3762" w:type="dxa"/>
-            <w:tcBorders>
-              <w:left w:val="single" w:sz="2" w:space="0" w:color="BFC7D5"/>
-              <w:bottom w:val="single" w:sz="2" w:space="0" w:color="BFC7D5"/>
-              <w:right w:val="single" w:sz="6" w:space="0" w:color="BFC7D5"/>
-            </w:tcBorders>
-            <w:vAlign w:val="center"/>
-          </w:tcPr>
-          <w:p>
-            <w:pPr>
-              <w:pStyle w:val="TableContents"/>
-              <w:bidi w:val="0"/>
-              <w:spacing w:before="0" w:after="283"/>
-              <w:jc w:val="left"/>
-              <w:rPr/>
-            </w:pPr>
-            <w:r>
-              <w:rPr/>
-              <w:t>Alexander Peter (EchoMind Project Lead) — 2026-10-07</w:t>
+            <w:tcW w:w="3960" w:type="dxa"/>
+            <w:tcBorders>
+              <w:left w:val="single" w:sz="2" w:space="0" w:color="BFC7D5"/>
+              <w:bottom w:val="single" w:sz="2" w:space="0" w:color="BFC7D5"/>
+              <w:right w:val="single" w:sz="6" w:space="0" w:color="BFC7D5"/>
+            </w:tcBorders>
+            <w:vAlign w:val="center"/>
+          </w:tcPr>
+          <w:p>
+            <w:pPr>
+              <w:pStyle w:val="TableContents"/>
+              <w:bidi w:val="0"/>
+              <w:spacing w:before="0" w:after="283"/>
+              <w:jc w:val="left"/>
+              <w:rPr/>
+            </w:pPr>
+            <w:r>
+              <w:rPr/>
+              <w:t>Alexander Peter (EchoMind Project Lead) — 2026-10-07; revision 1.2 — to confirm</w:t>
             </w:r>
           </w:p>
         </w:tc>
@@ -562,7 +566,7 @@
         <w:trPr/>
         <w:tc>
           <w:tcPr>
-            <w:tcW w:w="1445" w:type="dxa"/>
+            <w:tcW w:w="1247" w:type="dxa"/>
             <w:tcBorders>
               <w:left w:val="single" w:sz="6" w:space="0" w:color="BFC7D5"/>
               <w:bottom w:val="single" w:sz="2" w:space="0" w:color="BFC7D5"/>
@@ -586,25 +590,25 @@
         </w:tc>
         <w:tc>
           <w:tcPr>
-            <w:tcW w:w="3762" w:type="dxa"/>
-            <w:tcBorders>
-              <w:left w:val="single" w:sz="2" w:space="0" w:color="BFC7D5"/>
-              <w:bottom w:val="single" w:sz="2" w:space="0" w:color="BFC7D5"/>
-              <w:right w:val="single" w:sz="6" w:space="0" w:color="BFC7D5"/>
-            </w:tcBorders>
-            <w:vAlign w:val="center"/>
-          </w:tcPr>
-          <w:p>
-            <w:pPr>
-              <w:pStyle w:val="TableContents"/>
-              <w:bidi w:val="0"/>
-              <w:spacing w:before="0" w:after="283"/>
-              <w:jc w:val="left"/>
-              <w:rPr/>
-            </w:pPr>
-            <w:r>
-              <w:rPr/>
-              <w:t>Sheryl Nazareth (QA / MR) — 2026-10-07</w:t>
+            <w:tcW w:w="3960" w:type="dxa"/>
+            <w:tcBorders>
+              <w:left w:val="single" w:sz="2" w:space="0" w:color="BFC7D5"/>
+              <w:bottom w:val="single" w:sz="2" w:space="0" w:color="BFC7D5"/>
+              <w:right w:val="single" w:sz="6" w:space="0" w:color="BFC7D5"/>
+            </w:tcBorders>
+            <w:vAlign w:val="center"/>
+          </w:tcPr>
+          <w:p>
+            <w:pPr>
+              <w:pStyle w:val="TableContents"/>
+              <w:bidi w:val="0"/>
+              <w:spacing w:before="0" w:after="283"/>
+              <w:jc w:val="left"/>
+              <w:rPr/>
+            </w:pPr>
+            <w:r>
+              <w:rPr/>
+              <w:t>Sheryl Nazareth (QA / MR) — 2026-10-07; revision 1.2 — to confirm</w:t>
             </w:r>
           </w:p>
         </w:tc>
@@ -613,7 +617,7 @@
         <w:trPr/>
         <w:tc>
           <w:tcPr>
-            <w:tcW w:w="1445" w:type="dxa"/>
+            <w:tcW w:w="1247" w:type="dxa"/>
             <w:tcBorders>
               <w:left w:val="single" w:sz="6" w:space="0" w:color="BFC7D5"/>
               <w:bottom w:val="single" w:sz="6" w:space="0" w:color="BFC7D5"/>
@@ -637,7 +641,7 @@
         </w:tc>
         <w:tc>
           <w:tcPr>
-            <w:tcW w:w="3762" w:type="dxa"/>
+            <w:tcW w:w="3960" w:type="dxa"/>
             <w:tcBorders>
               <w:left w:val="single" w:sz="2" w:space="0" w:color="BFC7D5"/>
               <w:bottom w:val="single" w:sz="6" w:space="0" w:color="BFC7D5"/>
@@ -679,6 +683,44 @@
       <w:r>
         <w:rPr/>
         <w:t xml:space="preserve"> Wording in this procedure about “one person” describes the engineering work, which is concentrated in the Lead Engineer. Within AJACE Inc. the roles are held by named people (QM-01 §7.1): independent review by the EchoMind Project Lead (Alexander Peter), verification and QMS maintenance by QA/MR (Sheryl Nazareth), approval and release authorisation by the Managing Director (Anita Johan); internal audit is provided by the AJACE Inc. corporate audit programme.</w:t>
+      </w:r>
+    </w:p>
+    <w:p>
+      <w:pPr>
+        <w:pStyle w:val="BlockQuotation"/>
+        <w:bidi w:val="0"/>
+        <w:jc w:val="left"/>
+        <w:rPr/>
+      </w:pPr>
+      <w:r>
+        <w:rPr>
+          <w:rStyle w:val="Strong"/>
+        </w:rPr>
+        <w:t>Revision 1.2 — 2026-10-20.</w:t>
+      </w:r>
+      <w:r>
+        <w:rPr/>
+        <w:t xml:space="preserve"> Adds §7a </w:t>
+      </w:r>
+      <w:r>
+        <w:rPr>
+          <w:rStyle w:val="Emphasis"/>
+        </w:rPr>
+        <w:t>AI impact assessment</w:t>
+      </w:r>
+      <w:r>
+        <w:rPr/>
+        <w:t xml:space="preserve">: a documented assessment of the impacts of the product's AI — including governance and ethical considerations — at the design-input stage and before each release, new use case, new model or new client sector. Raised by the surveillance audit of 2026-10-14, finding 6 (opportunity for improvement, clause 6.1.1); logged as OFI-2026-06 in </w:t>
+      </w:r>
+      <w:r>
+        <w:rPr>
+          <w:rStyle w:val="SourceText"/>
+        </w:rPr>
+        <w:t>REG-04</w:t>
+      </w:r>
+      <w:r>
+        <w:rPr/>
+        <w:t>. Changes: §3, §4.2 (stage 1a), §5.6, §7a, §10.</w:t>
       </w:r>
     </w:p>
     <w:p>
@@ -955,6 +997,108 @@
             <w:tcW w:w="1253" w:type="dxa"/>
             <w:tcBorders>
               <w:left w:val="single" w:sz="6" w:space="0" w:color="BFC7D5"/>
+              <w:bottom w:val="single" w:sz="2" w:space="0" w:color="BFC7D5"/>
+              <w:right w:val="single" w:sz="6" w:space="0" w:color="BFC7D5"/>
+            </w:tcBorders>
+            <w:vAlign w:val="center"/>
+          </w:tcPr>
+          <w:p>
+            <w:pPr>
+              <w:pStyle w:val="TableContents"/>
+              <w:bidi w:val="0"/>
+              <w:spacing w:before="0" w:after="283"/>
+              <w:jc w:val="left"/>
+              <w:rPr/>
+            </w:pPr>
+            <w:r>
+              <w:rPr/>
+              <w:t>Anyone contributing code</w:t>
+            </w:r>
+          </w:p>
+        </w:tc>
+        <w:tc>
+          <w:tcPr>
+            <w:tcW w:w="3954" w:type="dxa"/>
+            <w:tcBorders>
+              <w:left w:val="single" w:sz="2" w:space="0" w:color="BFC7D5"/>
+              <w:bottom w:val="single" w:sz="2" w:space="0" w:color="BFC7D5"/>
+              <w:right w:val="single" w:sz="6" w:space="0" w:color="BFC7D5"/>
+            </w:tcBorders>
+            <w:vAlign w:val="center"/>
+          </w:tcPr>
+          <w:p>
+            <w:pPr>
+              <w:pStyle w:val="TableContents"/>
+              <w:bidi w:val="0"/>
+              <w:spacing w:before="0" w:after="283"/>
+              <w:jc w:val="left"/>
+              <w:rPr/>
+            </w:pPr>
+            <w:r>
+              <w:rPr/>
+              <w:t>Applies this procedure to their own changes without exception, including small ones.</w:t>
+            </w:r>
+          </w:p>
+        </w:tc>
+      </w:tr>
+      <w:tr>
+        <w:trPr/>
+        <w:tc>
+          <w:tcPr>
+            <w:tcW w:w="1253" w:type="dxa"/>
+            <w:tcBorders>
+              <w:left w:val="single" w:sz="6" w:space="0" w:color="BFC7D5"/>
+              <w:bottom w:val="single" w:sz="2" w:space="0" w:color="BFC7D5"/>
+              <w:right w:val="single" w:sz="6" w:space="0" w:color="BFC7D5"/>
+            </w:tcBorders>
+            <w:vAlign w:val="center"/>
+          </w:tcPr>
+          <w:p>
+            <w:pPr>
+              <w:pStyle w:val="TableContents"/>
+              <w:bidi w:val="0"/>
+              <w:spacing w:before="0" w:after="283"/>
+              <w:jc w:val="left"/>
+              <w:rPr/>
+            </w:pPr>
+            <w:r>
+              <w:rPr/>
+              <w:t>EchoMind Project Lead</w:t>
+            </w:r>
+          </w:p>
+        </w:tc>
+        <w:tc>
+          <w:tcPr>
+            <w:tcW w:w="3954" w:type="dxa"/>
+            <w:tcBorders>
+              <w:left w:val="single" w:sz="2" w:space="0" w:color="BFC7D5"/>
+              <w:bottom w:val="single" w:sz="2" w:space="0" w:color="BFC7D5"/>
+              <w:right w:val="single" w:sz="6" w:space="0" w:color="BFC7D5"/>
+            </w:tcBorders>
+            <w:vAlign w:val="center"/>
+          </w:tcPr>
+          <w:p>
+            <w:pPr>
+              <w:pStyle w:val="TableContents"/>
+              <w:bidi w:val="0"/>
+              <w:spacing w:before="0" w:after="283"/>
+              <w:jc w:val="left"/>
+              <w:rPr/>
+            </w:pPr>
+            <w:r>
+              <w:rPr/>
+              <w:t>Reviews the AI impact assessment (§7a) for client, user and ethical impact.</w:t>
+            </w:r>
+          </w:p>
+        </w:tc>
+      </w:tr>
+      <w:tr>
+        <w:trPr/>
+        <w:tc>
+          <w:tcPr>
+            <w:tcW w:w="1253" w:type="dxa"/>
+            <w:tcBorders>
+              <w:left w:val="single" w:sz="6" w:space="0" w:color="BFC7D5"/>
               <w:bottom w:val="single" w:sz="6" w:space="0" w:color="BFC7D5"/>
               <w:right w:val="single" w:sz="6" w:space="0" w:color="BFC7D5"/>
             </w:tcBorders>
@@ -970,7 +1114,7 @@
             </w:pPr>
             <w:r>
               <w:rPr/>
-              <w:t>Anyone contributing code</w:t>
+              <w:t>Data custodian</w:t>
             </w:r>
           </w:p>
         </w:tc>
@@ -994,7 +1138,7 @@
             </w:pPr>
             <w:r>
               <w:rPr/>
-              <w:t>Applies this procedure to their own changes without exception, including small ones.</w:t>
+              <w:t>Reviews the AI impact assessment for data protection, consent and retention.</w:t>
             </w:r>
           </w:p>
         </w:tc>
@@ -2100,9 +2244,9 @@
         </w:tblCellMar>
       </w:tblPr>
       <w:tblGrid>
-        <w:gridCol w:w="1116"/>
-        <w:gridCol w:w="2030"/>
-        <w:gridCol w:w="2061"/>
+        <w:gridCol w:w="1129"/>
+        <w:gridCol w:w="2182"/>
+        <w:gridCol w:w="1896"/>
       </w:tblGrid>
       <w:tr>
         <w:trPr>
@@ -2110,7 +2254,7 @@
         </w:trPr>
         <w:tc>
           <w:tcPr>
-            <w:tcW w:w="1116" w:type="dxa"/>
+            <w:tcW w:w="1129" w:type="dxa"/>
             <w:tcBorders>
               <w:top w:val="single" w:sz="6" w:space="0" w:color="BFC7D5"/>
               <w:left w:val="single" w:sz="6" w:space="0" w:color="BFC7D5"/>
@@ -2140,7 +2284,7 @@
         </w:tc>
         <w:tc>
           <w:tcPr>
-            <w:tcW w:w="2030" w:type="dxa"/>
+            <w:tcW w:w="2182" w:type="dxa"/>
             <w:tcBorders>
               <w:top w:val="single" w:sz="6" w:space="0" w:color="BFC7D5"/>
               <w:left w:val="single" w:sz="2" w:space="0" w:color="BFC7D5"/>
@@ -2170,7 +2314,7 @@
         </w:tc>
         <w:tc>
           <w:tcPr>
-            <w:tcW w:w="2061" w:type="dxa"/>
+            <w:tcW w:w="1896" w:type="dxa"/>
             <w:tcBorders>
               <w:top w:val="single" w:sz="6" w:space="0" w:color="BFC7D5"/>
               <w:left w:val="single" w:sz="2" w:space="0" w:color="BFC7D5"/>
@@ -2203,7 +2347,7 @@
         <w:trPr/>
         <w:tc>
           <w:tcPr>
-            <w:tcW w:w="1116" w:type="dxa"/>
+            <w:tcW w:w="1129" w:type="dxa"/>
             <w:tcBorders>
               <w:left w:val="single" w:sz="6" w:space="0" w:color="BFC7D5"/>
               <w:bottom w:val="single" w:sz="2" w:space="0" w:color="BFC7D5"/>
@@ -2227,7 +2371,7 @@
         </w:tc>
         <w:tc>
           <w:tcPr>
-            <w:tcW w:w="2030" w:type="dxa"/>
+            <w:tcW w:w="2182" w:type="dxa"/>
             <w:tcBorders>
               <w:left w:val="single" w:sz="2" w:space="0" w:color="BFC7D5"/>
               <w:bottom w:val="single" w:sz="2" w:space="0" w:color="BFC7D5"/>
@@ -2251,7 +2395,7 @@
         </w:tc>
         <w:tc>
           <w:tcPr>
-            <w:tcW w:w="2061" w:type="dxa"/>
+            <w:tcW w:w="1896" w:type="dxa"/>
             <w:tcBorders>
               <w:left w:val="single" w:sz="2" w:space="0" w:color="BFC7D5"/>
               <w:bottom w:val="single" w:sz="2" w:space="0" w:color="BFC7D5"/>
@@ -2278,7 +2422,7 @@
         <w:trPr/>
         <w:tc>
           <w:tcPr>
-            <w:tcW w:w="1116" w:type="dxa"/>
+            <w:tcW w:w="1129" w:type="dxa"/>
             <w:tcBorders>
               <w:left w:val="single" w:sz="6" w:space="0" w:color="BFC7D5"/>
               <w:bottom w:val="single" w:sz="2" w:space="0" w:color="BFC7D5"/>
@@ -2296,55 +2440,55 @@
             </w:pPr>
             <w:r>
               <w:rPr/>
-              <w:t>2. Design and build</w:t>
-            </w:r>
-          </w:p>
-        </w:tc>
-        <w:tc>
-          <w:tcPr>
-            <w:tcW w:w="2030" w:type="dxa"/>
-            <w:tcBorders>
-              <w:left w:val="single" w:sz="2" w:space="0" w:color="BFC7D5"/>
-              <w:bottom w:val="single" w:sz="2" w:space="0" w:color="BFC7D5"/>
-              <w:right w:val="single" w:sz="6" w:space="0" w:color="BFC7D5"/>
-            </w:tcBorders>
-            <w:vAlign w:val="center"/>
-          </w:tcPr>
-          <w:p>
-            <w:pPr>
-              <w:pStyle w:val="TableContents"/>
-              <w:bidi w:val="0"/>
-              <w:spacing w:before="0" w:after="283"/>
-              <w:jc w:val="left"/>
-              <w:rPr/>
-            </w:pPr>
-            <w:r>
-              <w:rPr/>
-              <w:t>Working implementation exists</w:t>
-            </w:r>
-          </w:p>
-        </w:tc>
-        <w:tc>
-          <w:tcPr>
-            <w:tcW w:w="2061" w:type="dxa"/>
-            <w:tcBorders>
-              <w:left w:val="single" w:sz="2" w:space="0" w:color="BFC7D5"/>
-              <w:bottom w:val="single" w:sz="2" w:space="0" w:color="BFC7D5"/>
-              <w:right w:val="single" w:sz="6" w:space="0" w:color="BFC7D5"/>
-            </w:tcBorders>
-            <w:vAlign w:val="center"/>
-          </w:tcPr>
-          <w:p>
-            <w:pPr>
-              <w:pStyle w:val="TableContents"/>
-              <w:bidi w:val="0"/>
-              <w:spacing w:before="0" w:after="283"/>
-              <w:jc w:val="left"/>
-              <w:rPr/>
-            </w:pPr>
-            <w:r>
-              <w:rPr/>
-              <w:t>AI-output verification (§7) applies continuously</w:t>
+              <w:t>1a. AI impact assessed</w:t>
+            </w:r>
+          </w:p>
+        </w:tc>
+        <w:tc>
+          <w:tcPr>
+            <w:tcW w:w="2182" w:type="dxa"/>
+            <w:tcBorders>
+              <w:left w:val="single" w:sz="2" w:space="0" w:color="BFC7D5"/>
+              <w:bottom w:val="single" w:sz="2" w:space="0" w:color="BFC7D5"/>
+              <w:right w:val="single" w:sz="6" w:space="0" w:color="BFC7D5"/>
+            </w:tcBorders>
+            <w:vAlign w:val="center"/>
+          </w:tcPr>
+          <w:p>
+            <w:pPr>
+              <w:pStyle w:val="TableContents"/>
+              <w:bidi w:val="0"/>
+              <w:spacing w:before="0" w:after="283"/>
+              <w:jc w:val="left"/>
+              <w:rPr/>
+            </w:pPr>
+            <w:r>
+              <w:rPr/>
+              <w:t>The AI impact assessment (§7a) is updated for the change, and any new high impact has a control or an action with an owner</w:t>
+            </w:r>
+          </w:p>
+        </w:tc>
+        <w:tc>
+          <w:tcPr>
+            <w:tcW w:w="1896" w:type="dxa"/>
+            <w:tcBorders>
+              <w:left w:val="single" w:sz="2" w:space="0" w:color="BFC7D5"/>
+              <w:bottom w:val="single" w:sz="2" w:space="0" w:color="BFC7D5"/>
+              <w:right w:val="single" w:sz="6" w:space="0" w:color="BFC7D5"/>
+            </w:tcBorders>
+            <w:vAlign w:val="center"/>
+          </w:tcPr>
+          <w:p>
+            <w:pPr>
+              <w:pStyle w:val="TableContents"/>
+              <w:bidi w:val="0"/>
+              <w:spacing w:before="0" w:after="283"/>
+              <w:jc w:val="left"/>
+              <w:rPr/>
+            </w:pPr>
+            <w:r>
+              <w:rPr/>
+              <w:t>Review by the Project Lead and the data custodian (Class B and C)</w:t>
             </w:r>
           </w:p>
         </w:tc>
@@ -2353,7 +2497,7 @@
         <w:trPr/>
         <w:tc>
           <w:tcPr>
-            <w:tcW w:w="1116" w:type="dxa"/>
+            <w:tcW w:w="1129" w:type="dxa"/>
             <w:tcBorders>
               <w:left w:val="single" w:sz="6" w:space="0" w:color="BFC7D5"/>
               <w:bottom w:val="single" w:sz="2" w:space="0" w:color="BFC7D5"/>
@@ -2371,55 +2515,55 @@
             </w:pPr>
             <w:r>
               <w:rPr/>
-              <w:t>3. Verification</w:t>
-            </w:r>
-          </w:p>
-        </w:tc>
-        <w:tc>
-          <w:tcPr>
-            <w:tcW w:w="2030" w:type="dxa"/>
-            <w:tcBorders>
-              <w:left w:val="single" w:sz="2" w:space="0" w:color="BFC7D5"/>
-              <w:bottom w:val="single" w:sz="2" w:space="0" w:color="BFC7D5"/>
-              <w:right w:val="single" w:sz="6" w:space="0" w:color="BFC7D5"/>
-            </w:tcBorders>
-            <w:vAlign w:val="center"/>
-          </w:tcPr>
-          <w:p>
-            <w:pPr>
-              <w:pStyle w:val="TableContents"/>
-              <w:bidi w:val="0"/>
-              <w:spacing w:before="0" w:after="283"/>
-              <w:jc w:val="left"/>
-              <w:rPr/>
-            </w:pPr>
-            <w:r>
-              <w:rPr/>
-              <w:t>The outputs meet the stated inputs</w:t>
-            </w:r>
-          </w:p>
-        </w:tc>
-        <w:tc>
-          <w:tcPr>
-            <w:tcW w:w="2061" w:type="dxa"/>
-            <w:tcBorders>
-              <w:left w:val="single" w:sz="2" w:space="0" w:color="BFC7D5"/>
-              <w:bottom w:val="single" w:sz="2" w:space="0" w:color="BFC7D5"/>
-              <w:right w:val="single" w:sz="6" w:space="0" w:color="BFC7D5"/>
-            </w:tcBorders>
-            <w:vAlign w:val="center"/>
-          </w:tcPr>
-          <w:p>
-            <w:pPr>
-              <w:pStyle w:val="TableContents"/>
-              <w:bidi w:val="0"/>
-              <w:spacing w:before="0" w:after="283"/>
-              <w:jc w:val="left"/>
-              <w:rPr/>
-            </w:pPr>
-            <w:r>
-              <w:rPr/>
-              <w:t>§6.1 — unit tests, golden-question suite, targeted measurement</w:t>
+              <w:t>2. Design and build</w:t>
+            </w:r>
+          </w:p>
+        </w:tc>
+        <w:tc>
+          <w:tcPr>
+            <w:tcW w:w="2182" w:type="dxa"/>
+            <w:tcBorders>
+              <w:left w:val="single" w:sz="2" w:space="0" w:color="BFC7D5"/>
+              <w:bottom w:val="single" w:sz="2" w:space="0" w:color="BFC7D5"/>
+              <w:right w:val="single" w:sz="6" w:space="0" w:color="BFC7D5"/>
+            </w:tcBorders>
+            <w:vAlign w:val="center"/>
+          </w:tcPr>
+          <w:p>
+            <w:pPr>
+              <w:pStyle w:val="TableContents"/>
+              <w:bidi w:val="0"/>
+              <w:spacing w:before="0" w:after="283"/>
+              <w:jc w:val="left"/>
+              <w:rPr/>
+            </w:pPr>
+            <w:r>
+              <w:rPr/>
+              <w:t>Working implementation exists</w:t>
+            </w:r>
+          </w:p>
+        </w:tc>
+        <w:tc>
+          <w:tcPr>
+            <w:tcW w:w="1896" w:type="dxa"/>
+            <w:tcBorders>
+              <w:left w:val="single" w:sz="2" w:space="0" w:color="BFC7D5"/>
+              <w:bottom w:val="single" w:sz="2" w:space="0" w:color="BFC7D5"/>
+              <w:right w:val="single" w:sz="6" w:space="0" w:color="BFC7D5"/>
+            </w:tcBorders>
+            <w:vAlign w:val="center"/>
+          </w:tcPr>
+          <w:p>
+            <w:pPr>
+              <w:pStyle w:val="TableContents"/>
+              <w:bidi w:val="0"/>
+              <w:spacing w:before="0" w:after="283"/>
+              <w:jc w:val="left"/>
+              <w:rPr/>
+            </w:pPr>
+            <w:r>
+              <w:rPr/>
+              <w:t>AI-output verification (§7) applies continuously</w:t>
             </w:r>
           </w:p>
         </w:tc>
@@ -2428,7 +2572,7 @@
         <w:trPr/>
         <w:tc>
           <w:tcPr>
-            <w:tcW w:w="1116" w:type="dxa"/>
+            <w:tcW w:w="1129" w:type="dxa"/>
             <w:tcBorders>
               <w:left w:val="single" w:sz="6" w:space="0" w:color="BFC7D5"/>
               <w:bottom w:val="single" w:sz="2" w:space="0" w:color="BFC7D5"/>
@@ -2446,55 +2590,55 @@
             </w:pPr>
             <w:r>
               <w:rPr/>
-              <w:t>4. Validation</w:t>
-            </w:r>
-          </w:p>
-        </w:tc>
-        <w:tc>
-          <w:tcPr>
-            <w:tcW w:w="2030" w:type="dxa"/>
-            <w:tcBorders>
-              <w:left w:val="single" w:sz="2" w:space="0" w:color="BFC7D5"/>
-              <w:bottom w:val="single" w:sz="2" w:space="0" w:color="BFC7D5"/>
-              <w:right w:val="single" w:sz="6" w:space="0" w:color="BFC7D5"/>
-            </w:tcBorders>
-            <w:vAlign w:val="center"/>
-          </w:tcPr>
-          <w:p>
-            <w:pPr>
-              <w:pStyle w:val="TableContents"/>
-              <w:bidi w:val="0"/>
-              <w:spacing w:before="0" w:after="283"/>
-              <w:jc w:val="left"/>
-              <w:rPr/>
-            </w:pPr>
-            <w:r>
-              <w:rPr/>
-              <w:t>The result meets the intended use in the customer's context</w:t>
-            </w:r>
-          </w:p>
-        </w:tc>
-        <w:tc>
-          <w:tcPr>
-            <w:tcW w:w="2061" w:type="dxa"/>
-            <w:tcBorders>
-              <w:left w:val="single" w:sz="2" w:space="0" w:color="BFC7D5"/>
-              <w:bottom w:val="single" w:sz="2" w:space="0" w:color="BFC7D5"/>
-              <w:right w:val="single" w:sz="6" w:space="0" w:color="BFC7D5"/>
-            </w:tcBorders>
-            <w:vAlign w:val="center"/>
-          </w:tcPr>
-          <w:p>
-            <w:pPr>
-              <w:pStyle w:val="TableContents"/>
-              <w:bidi w:val="0"/>
-              <w:spacing w:before="0" w:after="283"/>
-              <w:jc w:val="left"/>
-              <w:rPr/>
-            </w:pPr>
-            <w:r>
-              <w:rPr/>
-              <w:t>§6.2</w:t>
+              <w:t>3. Verification</w:t>
+            </w:r>
+          </w:p>
+        </w:tc>
+        <w:tc>
+          <w:tcPr>
+            <w:tcW w:w="2182" w:type="dxa"/>
+            <w:tcBorders>
+              <w:left w:val="single" w:sz="2" w:space="0" w:color="BFC7D5"/>
+              <w:bottom w:val="single" w:sz="2" w:space="0" w:color="BFC7D5"/>
+              <w:right w:val="single" w:sz="6" w:space="0" w:color="BFC7D5"/>
+            </w:tcBorders>
+            <w:vAlign w:val="center"/>
+          </w:tcPr>
+          <w:p>
+            <w:pPr>
+              <w:pStyle w:val="TableContents"/>
+              <w:bidi w:val="0"/>
+              <w:spacing w:before="0" w:after="283"/>
+              <w:jc w:val="left"/>
+              <w:rPr/>
+            </w:pPr>
+            <w:r>
+              <w:rPr/>
+              <w:t>The outputs meet the stated inputs</w:t>
+            </w:r>
+          </w:p>
+        </w:tc>
+        <w:tc>
+          <w:tcPr>
+            <w:tcW w:w="1896" w:type="dxa"/>
+            <w:tcBorders>
+              <w:left w:val="single" w:sz="2" w:space="0" w:color="BFC7D5"/>
+              <w:bottom w:val="single" w:sz="2" w:space="0" w:color="BFC7D5"/>
+              <w:right w:val="single" w:sz="6" w:space="0" w:color="BFC7D5"/>
+            </w:tcBorders>
+            <w:vAlign w:val="center"/>
+          </w:tcPr>
+          <w:p>
+            <w:pPr>
+              <w:pStyle w:val="TableContents"/>
+              <w:bidi w:val="0"/>
+              <w:spacing w:before="0" w:after="283"/>
+              <w:jc w:val="left"/>
+              <w:rPr/>
+            </w:pPr>
+            <w:r>
+              <w:rPr/>
+              <w:t>§6.1 — unit tests, golden-question suite, targeted measurement</w:t>
             </w:r>
           </w:p>
         </w:tc>
@@ -2503,7 +2647,82 @@
         <w:trPr/>
         <w:tc>
           <w:tcPr>
-            <w:tcW w:w="1116" w:type="dxa"/>
+            <w:tcW w:w="1129" w:type="dxa"/>
+            <w:tcBorders>
+              <w:left w:val="single" w:sz="6" w:space="0" w:color="BFC7D5"/>
+              <w:bottom w:val="single" w:sz="2" w:space="0" w:color="BFC7D5"/>
+              <w:right w:val="single" w:sz="6" w:space="0" w:color="BFC7D5"/>
+            </w:tcBorders>
+            <w:vAlign w:val="center"/>
+          </w:tcPr>
+          <w:p>
+            <w:pPr>
+              <w:pStyle w:val="TableContents"/>
+              <w:bidi w:val="0"/>
+              <w:spacing w:before="0" w:after="283"/>
+              <w:jc w:val="left"/>
+              <w:rPr/>
+            </w:pPr>
+            <w:r>
+              <w:rPr/>
+              <w:t>4. Validation</w:t>
+            </w:r>
+          </w:p>
+        </w:tc>
+        <w:tc>
+          <w:tcPr>
+            <w:tcW w:w="2182" w:type="dxa"/>
+            <w:tcBorders>
+              <w:left w:val="single" w:sz="2" w:space="0" w:color="BFC7D5"/>
+              <w:bottom w:val="single" w:sz="2" w:space="0" w:color="BFC7D5"/>
+              <w:right w:val="single" w:sz="6" w:space="0" w:color="BFC7D5"/>
+            </w:tcBorders>
+            <w:vAlign w:val="center"/>
+          </w:tcPr>
+          <w:p>
+            <w:pPr>
+              <w:pStyle w:val="TableContents"/>
+              <w:bidi w:val="0"/>
+              <w:spacing w:before="0" w:after="283"/>
+              <w:jc w:val="left"/>
+              <w:rPr/>
+            </w:pPr>
+            <w:r>
+              <w:rPr/>
+              <w:t>The result meets the intended use in the customer's context</w:t>
+            </w:r>
+          </w:p>
+        </w:tc>
+        <w:tc>
+          <w:tcPr>
+            <w:tcW w:w="1896" w:type="dxa"/>
+            <w:tcBorders>
+              <w:left w:val="single" w:sz="2" w:space="0" w:color="BFC7D5"/>
+              <w:bottom w:val="single" w:sz="2" w:space="0" w:color="BFC7D5"/>
+              <w:right w:val="single" w:sz="6" w:space="0" w:color="BFC7D5"/>
+            </w:tcBorders>
+            <w:vAlign w:val="center"/>
+          </w:tcPr>
+          <w:p>
+            <w:pPr>
+              <w:pStyle w:val="TableContents"/>
+              <w:bidi w:val="0"/>
+              <w:spacing w:before="0" w:after="283"/>
+              <w:jc w:val="left"/>
+              <w:rPr/>
+            </w:pPr>
+            <w:r>
+              <w:rPr/>
+              <w:t>§6.2</w:t>
+            </w:r>
+          </w:p>
+        </w:tc>
+      </w:tr>
+      <w:tr>
+        <w:trPr/>
+        <w:tc>
+          <w:tcPr>
+            <w:tcW w:w="1129" w:type="dxa"/>
             <w:tcBorders>
               <w:left w:val="single" w:sz="6" w:space="0" w:color="BFC7D5"/>
               <w:bottom w:val="single" w:sz="6" w:space="0" w:color="BFC7D5"/>
@@ -2527,7 +2746,7 @@
         </w:tc>
         <w:tc>
           <w:tcPr>
-            <w:tcW w:w="2030" w:type="dxa"/>
+            <w:tcW w:w="2182" w:type="dxa"/>
             <w:tcBorders>
               <w:left w:val="single" w:sz="2" w:space="0" w:color="BFC7D5"/>
               <w:bottom w:val="single" w:sz="6" w:space="0" w:color="BFC7D5"/>
@@ -2545,13 +2764,13 @@
             </w:pPr>
             <w:r>
               <w:rPr/>
-              <w:t>Managing Director approves</w:t>
-            </w:r>
-          </w:p>
-        </w:tc>
-        <w:tc>
-          <w:tcPr>
-            <w:tcW w:w="2061" w:type="dxa"/>
+              <w:t>Managing Director approves; the AI impact assessment is current for the release</w:t>
+            </w:r>
+          </w:p>
+        </w:tc>
+        <w:tc>
+          <w:tcPr>
+            <w:tcW w:w="1896" w:type="dxa"/>
             <w:tcBorders>
               <w:left w:val="single" w:sz="2" w:space="0" w:color="BFC7D5"/>
               <w:bottom w:val="single" w:sz="6" w:space="0" w:color="BFC7D5"/>
@@ -3762,6 +3981,30 @@
       <w:r>
         <w:rPr/>
         <w:t xml:space="preserve"> §6.</w:t>
+      </w:r>
+    </w:p>
+    <w:p>
+      <w:pPr>
+        <w:pStyle w:val="Heading3"/>
+        <w:bidi w:val="0"/>
+        <w:jc w:val="left"/>
+        <w:rPr/>
+      </w:pPr>
+      <w:r>
+        <w:rPr/>
+        <w:t>5.6 Impacts of the AI on people</w:t>
+      </w:r>
+    </w:p>
+    <w:p>
+      <w:pPr>
+        <w:pStyle w:val="BodyText"/>
+        <w:bidi w:val="0"/>
+        <w:jc w:val="left"/>
+        <w:rPr/>
+      </w:pPr>
+      <w:r>
+        <w:rPr/>
+        <w:t>The AI impact assessment (§7a) is a design input. Its open actions — for example a recording notice, a bias measurement or a user statement that answers must be checked — are stated as requirements in the functional and non-functional requirement registers (EM26-20, EM26-21) and verified like any other requirement.</w:t>
       </w:r>
     </w:p>
     <w:p>
@@ -5764,6 +6007,1060 @@
       </w:pPr>
       <w:r>
         <w:rPr/>
+        <w:t>7a. AI impact assessment</w:t>
+      </w:r>
+    </w:p>
+    <w:p>
+      <w:pPr>
+        <w:pStyle w:val="BodyText"/>
+        <w:bidi w:val="0"/>
+        <w:jc w:val="left"/>
+        <w:rPr/>
+      </w:pPr>
+      <w:r>
+        <w:rPr/>
+        <w:t>EchoMind is an AI product: it transcribes people, answers from documents, generates documents and images, and checks statements during conversations. Its impacts on the people who use it and the people it affects are assessed systematically and recorded, not only handled control by control.</w:t>
+      </w:r>
+    </w:p>
+    <w:p>
+      <w:pPr>
+        <w:pStyle w:val="BodyText"/>
+        <w:bidi w:val="0"/>
+        <w:jc w:val="left"/>
+        <w:rPr/>
+      </w:pPr>
+      <w:r>
+        <w:rPr>
+          <w:rStyle w:val="Strong"/>
+        </w:rPr>
+        <w:t>When.</w:t>
+      </w:r>
+      <w:r>
+        <w:rPr/>
+        <w:t xml:space="preserve"> An AI impact assessment is made or updated:</w:t>
+      </w:r>
+    </w:p>
+    <w:p>
+      <w:pPr>
+        <w:pStyle w:val="BodyText"/>
+        <w:numPr>
+          <w:ilvl w:val="0"/>
+          <w:numId w:val="4"/>
+        </w:numPr>
+        <w:tabs>
+          <w:tab w:val="clear" w:pos="1134"/>
+          <w:tab w:val="left" w:pos="709" w:leader="none"/>
+        </w:tabs>
+        <w:bidi w:val="0"/>
+        <w:spacing w:before="0" w:after="0"/>
+        <w:ind w:hanging="283" w:left="709"/>
+        <w:jc w:val="left"/>
+        <w:rPr/>
+      </w:pPr>
+      <w:r>
+        <w:rPr/>
+        <w:t xml:space="preserve">at the design-input stage of a Class B or C change that adds or changes AI behaviour (stage 1a); </w:t>
+      </w:r>
+    </w:p>
+    <w:p>
+      <w:pPr>
+        <w:pStyle w:val="BodyText"/>
+        <w:numPr>
+          <w:ilvl w:val="0"/>
+          <w:numId w:val="4"/>
+        </w:numPr>
+        <w:tabs>
+          <w:tab w:val="clear" w:pos="1134"/>
+          <w:tab w:val="left" w:pos="709" w:leader="none"/>
+        </w:tabs>
+        <w:bidi w:val="0"/>
+        <w:spacing w:before="0" w:after="0"/>
+        <w:ind w:hanging="283" w:left="709"/>
+        <w:jc w:val="left"/>
+        <w:rPr/>
+      </w:pPr>
+      <w:r>
+        <w:rPr/>
+        <w:t xml:space="preserve">for every new use case, and for every new client sector or region; </w:t>
+      </w:r>
+    </w:p>
+    <w:p>
+      <w:pPr>
+        <w:pStyle w:val="BodyText"/>
+        <w:numPr>
+          <w:ilvl w:val="0"/>
+          <w:numId w:val="4"/>
+        </w:numPr>
+        <w:tabs>
+          <w:tab w:val="clear" w:pos="1134"/>
+          <w:tab w:val="left" w:pos="709" w:leader="none"/>
+        </w:tabs>
+        <w:bidi w:val="0"/>
+        <w:spacing w:before="0" w:after="0"/>
+        <w:ind w:hanging="283" w:left="709"/>
+        <w:jc w:val="left"/>
+        <w:rPr/>
+      </w:pPr>
+      <w:r>
+        <w:rPr/>
+        <w:t xml:space="preserve">when a model is added or replaced (REG-02 §2); </w:t>
+      </w:r>
+    </w:p>
+    <w:p>
+      <w:pPr>
+        <w:pStyle w:val="BodyText"/>
+        <w:numPr>
+          <w:ilvl w:val="0"/>
+          <w:numId w:val="4"/>
+        </w:numPr>
+        <w:tabs>
+          <w:tab w:val="clear" w:pos="1134"/>
+          <w:tab w:val="left" w:pos="709" w:leader="none"/>
+        </w:tabs>
+        <w:bidi w:val="0"/>
+        <w:spacing w:before="0" w:after="0"/>
+        <w:ind w:hanging="283" w:left="709"/>
+        <w:jc w:val="left"/>
+        <w:rPr/>
+      </w:pPr>
+      <w:r>
+        <w:rPr/>
+        <w:t xml:space="preserve">before each release — the release record in REG-08 states that the assessment is current; </w:t>
+      </w:r>
+    </w:p>
+    <w:p>
+      <w:pPr>
+        <w:pStyle w:val="BodyText"/>
+        <w:numPr>
+          <w:ilvl w:val="0"/>
+          <w:numId w:val="4"/>
+        </w:numPr>
+        <w:tabs>
+          <w:tab w:val="clear" w:pos="1134"/>
+          <w:tab w:val="left" w:pos="709" w:leader="none"/>
+        </w:tabs>
+        <w:bidi w:val="0"/>
+        <w:spacing w:before="0" w:after="0"/>
+        <w:ind w:hanging="283" w:left="709"/>
+        <w:jc w:val="left"/>
+        <w:rPr/>
+      </w:pPr>
+      <w:r>
+        <w:rPr/>
+        <w:t xml:space="preserve">after any incident or complaint involving AI output; </w:t>
+      </w:r>
+    </w:p>
+    <w:p>
+      <w:pPr>
+        <w:pStyle w:val="BodyText"/>
+        <w:numPr>
+          <w:ilvl w:val="0"/>
+          <w:numId w:val="4"/>
+        </w:numPr>
+        <w:tabs>
+          <w:tab w:val="clear" w:pos="1134"/>
+          <w:tab w:val="left" w:pos="709" w:leader="none"/>
+        </w:tabs>
+        <w:bidi w:val="0"/>
+        <w:ind w:hanging="283" w:left="709"/>
+        <w:jc w:val="left"/>
+        <w:rPr/>
+      </w:pPr>
+      <w:r>
+        <w:rPr/>
+        <w:t xml:space="preserve">at management review (SOP-15) and internal audit (SOP-13). </w:t>
+      </w:r>
+    </w:p>
+    <w:p>
+      <w:pPr>
+        <w:pStyle w:val="BodyText"/>
+        <w:bidi w:val="0"/>
+        <w:jc w:val="left"/>
+        <w:rPr/>
+      </w:pPr>
+      <w:r>
+        <w:rPr>
+          <w:rStyle w:val="Strong"/>
+        </w:rPr>
+        <w:t>What is assessed.</w:t>
+      </w:r>
+      <w:r>
+        <w:rPr/>
+        <w:t xml:space="preserve"> For each area: who is affected, the possible impact, the rating before and after controls (High / Medium / Low), the controls in place and their evidence, the gap, and the action with an owner and a date.</w:t>
+      </w:r>
+    </w:p>
+    <w:tbl>
+      <w:tblPr>
+        <w:tblW w:w="5000" w:type="pct"/>
+        <w:jc w:val="left"/>
+        <w:tblInd w:w="-7" w:type="dxa"/>
+        <w:tblLayout w:type="fixed"/>
+        <w:tblCellMar>
+          <w:top w:w="60" w:type="dxa"/>
+          <w:left w:w="60" w:type="dxa"/>
+          <w:bottom w:w="60" w:type="dxa"/>
+          <w:right w:w="60" w:type="dxa"/>
+        </w:tblCellMar>
+      </w:tblPr>
+      <w:tblGrid>
+        <w:gridCol w:w="1726"/>
+        <w:gridCol w:w="3481"/>
+      </w:tblGrid>
+      <w:tr>
+        <w:trPr>
+          <w:tblHeader w:val="true"/>
+        </w:trPr>
+        <w:tc>
+          <w:tcPr>
+            <w:tcW w:w="1726" w:type="dxa"/>
+            <w:tcBorders>
+              <w:top w:val="single" w:sz="6" w:space="0" w:color="BFC7D5"/>
+              <w:left w:val="single" w:sz="6" w:space="0" w:color="BFC7D5"/>
+              <w:bottom w:val="single" w:sz="2" w:space="0" w:color="BFC7D5"/>
+              <w:right w:val="single" w:sz="6" w:space="0" w:color="BFC7D5"/>
+            </w:tcBorders>
+            <w:shd w:fill="1F3A5F" w:val="clear"/>
+            <w:vAlign w:val="center"/>
+          </w:tcPr>
+          <w:p>
+            <w:pPr>
+              <w:pStyle w:val="TableHeading"/>
+              <w:bidi w:val="0"/>
+              <w:spacing w:before="0" w:after="283"/>
+              <w:jc w:val="left"/>
+              <w:rPr>
+                <w:color w:val="FFFFFF"/>
+              </w:rPr>
+            </w:pPr>
+            <w:r>
+              <w:rPr>
+                <w:color w:val="FFFFFF"/>
+              </w:rPr>
+              <w:t>Area</w:t>
+            </w:r>
+          </w:p>
+        </w:tc>
+        <w:tc>
+          <w:tcPr>
+            <w:tcW w:w="3481" w:type="dxa"/>
+            <w:tcBorders>
+              <w:top w:val="single" w:sz="6" w:space="0" w:color="BFC7D5"/>
+              <w:left w:val="single" w:sz="2" w:space="0" w:color="BFC7D5"/>
+              <w:bottom w:val="single" w:sz="2" w:space="0" w:color="BFC7D5"/>
+              <w:right w:val="single" w:sz="6" w:space="0" w:color="BFC7D5"/>
+            </w:tcBorders>
+            <w:shd w:fill="1F3A5F" w:val="clear"/>
+            <w:vAlign w:val="center"/>
+          </w:tcPr>
+          <w:p>
+            <w:pPr>
+              <w:pStyle w:val="TableHeading"/>
+              <w:bidi w:val="0"/>
+              <w:spacing w:before="0" w:after="283"/>
+              <w:jc w:val="left"/>
+              <w:rPr>
+                <w:color w:val="FFFFFF"/>
+              </w:rPr>
+            </w:pPr>
+            <w:r>
+              <w:rPr>
+                <w:color w:val="FFFFFF"/>
+              </w:rPr>
+              <w:t>Question</w:t>
+            </w:r>
+          </w:p>
+        </w:tc>
+      </w:tr>
+      <w:tr>
+        <w:trPr/>
+        <w:tc>
+          <w:tcPr>
+            <w:tcW w:w="1726" w:type="dxa"/>
+            <w:tcBorders>
+              <w:left w:val="single" w:sz="6" w:space="0" w:color="BFC7D5"/>
+              <w:bottom w:val="single" w:sz="2" w:space="0" w:color="BFC7D5"/>
+              <w:right w:val="single" w:sz="6" w:space="0" w:color="BFC7D5"/>
+            </w:tcBorders>
+            <w:vAlign w:val="center"/>
+          </w:tcPr>
+          <w:p>
+            <w:pPr>
+              <w:pStyle w:val="TableContents"/>
+              <w:bidi w:val="0"/>
+              <w:spacing w:before="0" w:after="283"/>
+              <w:jc w:val="left"/>
+              <w:rPr/>
+            </w:pPr>
+            <w:r>
+              <w:rPr/>
+              <w:t>Privacy and data protection</w:t>
+            </w:r>
+          </w:p>
+        </w:tc>
+        <w:tc>
+          <w:tcPr>
+            <w:tcW w:w="3481" w:type="dxa"/>
+            <w:tcBorders>
+              <w:left w:val="single" w:sz="2" w:space="0" w:color="BFC7D5"/>
+              <w:bottom w:val="single" w:sz="2" w:space="0" w:color="BFC7D5"/>
+              <w:right w:val="single" w:sz="6" w:space="0" w:color="BFC7D5"/>
+            </w:tcBorders>
+            <w:vAlign w:val="center"/>
+          </w:tcPr>
+          <w:p>
+            <w:pPr>
+              <w:pStyle w:val="TableContents"/>
+              <w:bidi w:val="0"/>
+              <w:spacing w:before="0" w:after="283"/>
+              <w:jc w:val="left"/>
+              <w:rPr/>
+            </w:pPr>
+            <w:r>
+              <w:rPr/>
+              <w:t>Can personal or client data leave the client's control, or be kept longer than needed?</w:t>
+            </w:r>
+          </w:p>
+        </w:tc>
+      </w:tr>
+      <w:tr>
+        <w:trPr/>
+        <w:tc>
+          <w:tcPr>
+            <w:tcW w:w="1726" w:type="dxa"/>
+            <w:tcBorders>
+              <w:left w:val="single" w:sz="6" w:space="0" w:color="BFC7D5"/>
+              <w:bottom w:val="single" w:sz="2" w:space="0" w:color="BFC7D5"/>
+              <w:right w:val="single" w:sz="6" w:space="0" w:color="BFC7D5"/>
+            </w:tcBorders>
+            <w:vAlign w:val="center"/>
+          </w:tcPr>
+          <w:p>
+            <w:pPr>
+              <w:pStyle w:val="TableContents"/>
+              <w:bidi w:val="0"/>
+              <w:spacing w:before="0" w:after="283"/>
+              <w:jc w:val="left"/>
+              <w:rPr/>
+            </w:pPr>
+            <w:r>
+              <w:rPr/>
+              <w:t>Consent</w:t>
+            </w:r>
+          </w:p>
+        </w:tc>
+        <w:tc>
+          <w:tcPr>
+            <w:tcW w:w="3481" w:type="dxa"/>
+            <w:tcBorders>
+              <w:left w:val="single" w:sz="2" w:space="0" w:color="BFC7D5"/>
+              <w:bottom w:val="single" w:sz="2" w:space="0" w:color="BFC7D5"/>
+              <w:right w:val="single" w:sz="6" w:space="0" w:color="BFC7D5"/>
+            </w:tcBorders>
+            <w:vAlign w:val="center"/>
+          </w:tcPr>
+          <w:p>
+            <w:pPr>
+              <w:pStyle w:val="TableContents"/>
+              <w:bidi w:val="0"/>
+              <w:spacing w:before="0" w:after="283"/>
+              <w:jc w:val="left"/>
+              <w:rPr/>
+            </w:pPr>
+            <w:r>
+              <w:rPr/>
+              <w:t>Do people who are recorded or transcribed know, and has the customer been told what consent it needs?</w:t>
+            </w:r>
+          </w:p>
+        </w:tc>
+      </w:tr>
+      <w:tr>
+        <w:trPr/>
+        <w:tc>
+          <w:tcPr>
+            <w:tcW w:w="1726" w:type="dxa"/>
+            <w:tcBorders>
+              <w:left w:val="single" w:sz="6" w:space="0" w:color="BFC7D5"/>
+              <w:bottom w:val="single" w:sz="2" w:space="0" w:color="BFC7D5"/>
+              <w:right w:val="single" w:sz="6" w:space="0" w:color="BFC7D5"/>
+            </w:tcBorders>
+            <w:vAlign w:val="center"/>
+          </w:tcPr>
+          <w:p>
+            <w:pPr>
+              <w:pStyle w:val="TableContents"/>
+              <w:bidi w:val="0"/>
+              <w:spacing w:before="0" w:after="283"/>
+              <w:jc w:val="left"/>
+              <w:rPr/>
+            </w:pPr>
+            <w:r>
+              <w:rPr/>
+              <w:t>Accuracy</w:t>
+            </w:r>
+          </w:p>
+        </w:tc>
+        <w:tc>
+          <w:tcPr>
+            <w:tcW w:w="3481" w:type="dxa"/>
+            <w:tcBorders>
+              <w:left w:val="single" w:sz="2" w:space="0" w:color="BFC7D5"/>
+              <w:bottom w:val="single" w:sz="2" w:space="0" w:color="BFC7D5"/>
+              <w:right w:val="single" w:sz="6" w:space="0" w:color="BFC7D5"/>
+            </w:tcBorders>
+            <w:vAlign w:val="center"/>
+          </w:tcPr>
+          <w:p>
+            <w:pPr>
+              <w:pStyle w:val="TableContents"/>
+              <w:bidi w:val="0"/>
+              <w:spacing w:before="0" w:after="283"/>
+              <w:jc w:val="left"/>
+              <w:rPr/>
+            </w:pPr>
+            <w:r>
+              <w:rPr/>
+              <w:t>Can the output be wrong or invented, and is that measured?</w:t>
+            </w:r>
+          </w:p>
+        </w:tc>
+      </w:tr>
+      <w:tr>
+        <w:trPr/>
+        <w:tc>
+          <w:tcPr>
+            <w:tcW w:w="1726" w:type="dxa"/>
+            <w:tcBorders>
+              <w:left w:val="single" w:sz="6" w:space="0" w:color="BFC7D5"/>
+              <w:bottom w:val="single" w:sz="2" w:space="0" w:color="BFC7D5"/>
+              <w:right w:val="single" w:sz="6" w:space="0" w:color="BFC7D5"/>
+            </w:tcBorders>
+            <w:vAlign w:val="center"/>
+          </w:tcPr>
+          <w:p>
+            <w:pPr>
+              <w:pStyle w:val="TableContents"/>
+              <w:bidi w:val="0"/>
+              <w:spacing w:before="0" w:after="283"/>
+              <w:jc w:val="left"/>
+              <w:rPr/>
+            </w:pPr>
+            <w:r>
+              <w:rPr/>
+              <w:t>Over-reliance</w:t>
+            </w:r>
+          </w:p>
+        </w:tc>
+        <w:tc>
+          <w:tcPr>
+            <w:tcW w:w="3481" w:type="dxa"/>
+            <w:tcBorders>
+              <w:left w:val="single" w:sz="2" w:space="0" w:color="BFC7D5"/>
+              <w:bottom w:val="single" w:sz="2" w:space="0" w:color="BFC7D5"/>
+              <w:right w:val="single" w:sz="6" w:space="0" w:color="BFC7D5"/>
+            </w:tcBorders>
+            <w:vAlign w:val="center"/>
+          </w:tcPr>
+          <w:p>
+            <w:pPr>
+              <w:pStyle w:val="TableContents"/>
+              <w:bidi w:val="0"/>
+              <w:spacing w:before="0" w:after="283"/>
+              <w:jc w:val="left"/>
+              <w:rPr/>
+            </w:pPr>
+            <w:r>
+              <w:rPr/>
+              <w:t>Are users told to check the output, and can they see the source?</w:t>
+            </w:r>
+          </w:p>
+        </w:tc>
+      </w:tr>
+      <w:tr>
+        <w:trPr/>
+        <w:tc>
+          <w:tcPr>
+            <w:tcW w:w="1726" w:type="dxa"/>
+            <w:tcBorders>
+              <w:left w:val="single" w:sz="6" w:space="0" w:color="BFC7D5"/>
+              <w:bottom w:val="single" w:sz="2" w:space="0" w:color="BFC7D5"/>
+              <w:right w:val="single" w:sz="6" w:space="0" w:color="BFC7D5"/>
+            </w:tcBorders>
+            <w:vAlign w:val="center"/>
+          </w:tcPr>
+          <w:p>
+            <w:pPr>
+              <w:pStyle w:val="TableContents"/>
+              <w:bidi w:val="0"/>
+              <w:spacing w:before="0" w:after="283"/>
+              <w:jc w:val="left"/>
+              <w:rPr/>
+            </w:pPr>
+            <w:r>
+              <w:rPr/>
+              <w:t>Bias and fairness</w:t>
+            </w:r>
+          </w:p>
+        </w:tc>
+        <w:tc>
+          <w:tcPr>
+            <w:tcW w:w="3481" w:type="dxa"/>
+            <w:tcBorders>
+              <w:left w:val="single" w:sz="2" w:space="0" w:color="BFC7D5"/>
+              <w:bottom w:val="single" w:sz="2" w:space="0" w:color="BFC7D5"/>
+              <w:right w:val="single" w:sz="6" w:space="0" w:color="BFC7D5"/>
+            </w:tcBorders>
+            <w:vAlign w:val="center"/>
+          </w:tcPr>
+          <w:p>
+            <w:pPr>
+              <w:pStyle w:val="TableContents"/>
+              <w:bidi w:val="0"/>
+              <w:spacing w:before="0" w:after="283"/>
+              <w:jc w:val="left"/>
+              <w:rPr/>
+            </w:pPr>
+            <w:r>
+              <w:rPr/>
+              <w:t>Does quality differ by accent, language, sector or group, and is that measured?</w:t>
+            </w:r>
+          </w:p>
+        </w:tc>
+      </w:tr>
+      <w:tr>
+        <w:trPr/>
+        <w:tc>
+          <w:tcPr>
+            <w:tcW w:w="1726" w:type="dxa"/>
+            <w:tcBorders>
+              <w:left w:val="single" w:sz="6" w:space="0" w:color="BFC7D5"/>
+              <w:bottom w:val="single" w:sz="2" w:space="0" w:color="BFC7D5"/>
+              <w:right w:val="single" w:sz="6" w:space="0" w:color="BFC7D5"/>
+            </w:tcBorders>
+            <w:vAlign w:val="center"/>
+          </w:tcPr>
+          <w:p>
+            <w:pPr>
+              <w:pStyle w:val="TableContents"/>
+              <w:bidi w:val="0"/>
+              <w:spacing w:before="0" w:after="283"/>
+              <w:jc w:val="left"/>
+              <w:rPr/>
+            </w:pPr>
+            <w:r>
+              <w:rPr/>
+              <w:t>Transparency</w:t>
+            </w:r>
+          </w:p>
+        </w:tc>
+        <w:tc>
+          <w:tcPr>
+            <w:tcW w:w="3481" w:type="dxa"/>
+            <w:tcBorders>
+              <w:left w:val="single" w:sz="2" w:space="0" w:color="BFC7D5"/>
+              <w:bottom w:val="single" w:sz="2" w:space="0" w:color="BFC7D5"/>
+              <w:right w:val="single" w:sz="6" w:space="0" w:color="BFC7D5"/>
+            </w:tcBorders>
+            <w:vAlign w:val="center"/>
+          </w:tcPr>
+          <w:p>
+            <w:pPr>
+              <w:pStyle w:val="TableContents"/>
+              <w:bidi w:val="0"/>
+              <w:spacing w:before="0" w:after="283"/>
+              <w:jc w:val="left"/>
+              <w:rPr/>
+            </w:pPr>
+            <w:r>
+              <w:rPr/>
+              <w:t>Can a user see why an answer was given?</w:t>
+            </w:r>
+          </w:p>
+        </w:tc>
+      </w:tr>
+      <w:tr>
+        <w:trPr/>
+        <w:tc>
+          <w:tcPr>
+            <w:tcW w:w="1726" w:type="dxa"/>
+            <w:tcBorders>
+              <w:left w:val="single" w:sz="6" w:space="0" w:color="BFC7D5"/>
+              <w:bottom w:val="single" w:sz="2" w:space="0" w:color="BFC7D5"/>
+              <w:right w:val="single" w:sz="6" w:space="0" w:color="BFC7D5"/>
+            </w:tcBorders>
+            <w:vAlign w:val="center"/>
+          </w:tcPr>
+          <w:p>
+            <w:pPr>
+              <w:pStyle w:val="TableContents"/>
+              <w:bidi w:val="0"/>
+              <w:spacing w:before="0" w:after="283"/>
+              <w:jc w:val="left"/>
+              <w:rPr/>
+            </w:pPr>
+            <w:r>
+              <w:rPr/>
+              <w:t>Human oversight</w:t>
+            </w:r>
+          </w:p>
+        </w:tc>
+        <w:tc>
+          <w:tcPr>
+            <w:tcW w:w="3481" w:type="dxa"/>
+            <w:tcBorders>
+              <w:left w:val="single" w:sz="2" w:space="0" w:color="BFC7D5"/>
+              <w:bottom w:val="single" w:sz="2" w:space="0" w:color="BFC7D5"/>
+              <w:right w:val="single" w:sz="6" w:space="0" w:color="BFC7D5"/>
+            </w:tcBorders>
+            <w:vAlign w:val="center"/>
+          </w:tcPr>
+          <w:p>
+            <w:pPr>
+              <w:pStyle w:val="TableContents"/>
+              <w:bidi w:val="0"/>
+              <w:spacing w:before="0" w:after="283"/>
+              <w:jc w:val="left"/>
+              <w:rPr/>
+            </w:pPr>
+            <w:r>
+              <w:rPr/>
+              <w:t>Does the system make or act on decisions about people without a human?</w:t>
+            </w:r>
+          </w:p>
+        </w:tc>
+      </w:tr>
+      <w:tr>
+        <w:trPr/>
+        <w:tc>
+          <w:tcPr>
+            <w:tcW w:w="1726" w:type="dxa"/>
+            <w:tcBorders>
+              <w:left w:val="single" w:sz="6" w:space="0" w:color="BFC7D5"/>
+              <w:bottom w:val="single" w:sz="2" w:space="0" w:color="BFC7D5"/>
+              <w:right w:val="single" w:sz="6" w:space="0" w:color="BFC7D5"/>
+            </w:tcBorders>
+            <w:vAlign w:val="center"/>
+          </w:tcPr>
+          <w:p>
+            <w:pPr>
+              <w:pStyle w:val="TableContents"/>
+              <w:bidi w:val="0"/>
+              <w:spacing w:before="0" w:after="283"/>
+              <w:jc w:val="left"/>
+              <w:rPr/>
+            </w:pPr>
+            <w:r>
+              <w:rPr/>
+              <w:t>Security and misuse</w:t>
+            </w:r>
+          </w:p>
+        </w:tc>
+        <w:tc>
+          <w:tcPr>
+            <w:tcW w:w="3481" w:type="dxa"/>
+            <w:tcBorders>
+              <w:left w:val="single" w:sz="2" w:space="0" w:color="BFC7D5"/>
+              <w:bottom w:val="single" w:sz="2" w:space="0" w:color="BFC7D5"/>
+              <w:right w:val="single" w:sz="6" w:space="0" w:color="BFC7D5"/>
+            </w:tcBorders>
+            <w:vAlign w:val="center"/>
+          </w:tcPr>
+          <w:p>
+            <w:pPr>
+              <w:pStyle w:val="TableContents"/>
+              <w:bidi w:val="0"/>
+              <w:spacing w:before="0" w:after="283"/>
+              <w:jc w:val="left"/>
+              <w:rPr/>
+            </w:pPr>
+            <w:r>
+              <w:rPr/>
+              <w:t>Prompt injection, unauthorised access, misuse of the output</w:t>
+            </w:r>
+          </w:p>
+        </w:tc>
+      </w:tr>
+      <w:tr>
+        <w:trPr/>
+        <w:tc>
+          <w:tcPr>
+            <w:tcW w:w="1726" w:type="dxa"/>
+            <w:tcBorders>
+              <w:left w:val="single" w:sz="6" w:space="0" w:color="BFC7D5"/>
+              <w:bottom w:val="single" w:sz="2" w:space="0" w:color="BFC7D5"/>
+              <w:right w:val="single" w:sz="6" w:space="0" w:color="BFC7D5"/>
+            </w:tcBorders>
+            <w:vAlign w:val="center"/>
+          </w:tcPr>
+          <w:p>
+            <w:pPr>
+              <w:pStyle w:val="TableContents"/>
+              <w:bidi w:val="0"/>
+              <w:spacing w:before="0" w:after="283"/>
+              <w:jc w:val="left"/>
+              <w:rPr/>
+            </w:pPr>
+            <w:r>
+              <w:rPr/>
+              <w:t>Confidentiality between clients</w:t>
+            </w:r>
+          </w:p>
+        </w:tc>
+        <w:tc>
+          <w:tcPr>
+            <w:tcW w:w="3481" w:type="dxa"/>
+            <w:tcBorders>
+              <w:left w:val="single" w:sz="2" w:space="0" w:color="BFC7D5"/>
+              <w:bottom w:val="single" w:sz="2" w:space="0" w:color="BFC7D5"/>
+              <w:right w:val="single" w:sz="6" w:space="0" w:color="BFC7D5"/>
+            </w:tcBorders>
+            <w:vAlign w:val="center"/>
+          </w:tcPr>
+          <w:p>
+            <w:pPr>
+              <w:pStyle w:val="TableContents"/>
+              <w:bidi w:val="0"/>
+              <w:spacing w:before="0" w:after="283"/>
+              <w:jc w:val="left"/>
+              <w:rPr/>
+            </w:pPr>
+            <w:r>
+              <w:rPr/>
+              <w:t>Can one client see another's data?</w:t>
+            </w:r>
+          </w:p>
+        </w:tc>
+      </w:tr>
+      <w:tr>
+        <w:trPr/>
+        <w:tc>
+          <w:tcPr>
+            <w:tcW w:w="1726" w:type="dxa"/>
+            <w:tcBorders>
+              <w:left w:val="single" w:sz="6" w:space="0" w:color="BFC7D5"/>
+              <w:bottom w:val="single" w:sz="2" w:space="0" w:color="BFC7D5"/>
+              <w:right w:val="single" w:sz="6" w:space="0" w:color="BFC7D5"/>
+            </w:tcBorders>
+            <w:vAlign w:val="center"/>
+          </w:tcPr>
+          <w:p>
+            <w:pPr>
+              <w:pStyle w:val="TableContents"/>
+              <w:bidi w:val="0"/>
+              <w:spacing w:before="0" w:after="283"/>
+              <w:jc w:val="left"/>
+              <w:rPr/>
+            </w:pPr>
+            <w:r>
+              <w:rPr/>
+              <w:t>Model provenance and licences</w:t>
+            </w:r>
+          </w:p>
+        </w:tc>
+        <w:tc>
+          <w:tcPr>
+            <w:tcW w:w="3481" w:type="dxa"/>
+            <w:tcBorders>
+              <w:left w:val="single" w:sz="2" w:space="0" w:color="BFC7D5"/>
+              <w:bottom w:val="single" w:sz="2" w:space="0" w:color="BFC7D5"/>
+              <w:right w:val="single" w:sz="6" w:space="0" w:color="BFC7D5"/>
+            </w:tcBorders>
+            <w:vAlign w:val="center"/>
+          </w:tcPr>
+          <w:p>
+            <w:pPr>
+              <w:pStyle w:val="TableContents"/>
+              <w:bidi w:val="0"/>
+              <w:spacing w:before="0" w:after="283"/>
+              <w:jc w:val="left"/>
+              <w:rPr/>
+            </w:pPr>
+            <w:r>
+              <w:rPr/>
+              <w:t>Is each model used within its licence terms?</w:t>
+            </w:r>
+          </w:p>
+        </w:tc>
+      </w:tr>
+      <w:tr>
+        <w:trPr/>
+        <w:tc>
+          <w:tcPr>
+            <w:tcW w:w="1726" w:type="dxa"/>
+            <w:tcBorders>
+              <w:left w:val="single" w:sz="6" w:space="0" w:color="BFC7D5"/>
+              <w:bottom w:val="single" w:sz="2" w:space="0" w:color="BFC7D5"/>
+              <w:right w:val="single" w:sz="6" w:space="0" w:color="BFC7D5"/>
+            </w:tcBorders>
+            <w:vAlign w:val="center"/>
+          </w:tcPr>
+          <w:p>
+            <w:pPr>
+              <w:pStyle w:val="TableContents"/>
+              <w:bidi w:val="0"/>
+              <w:spacing w:before="0" w:after="283"/>
+              <w:jc w:val="left"/>
+              <w:rPr/>
+            </w:pPr>
+            <w:r>
+              <w:rPr/>
+              <w:t>Generated content</w:t>
+            </w:r>
+          </w:p>
+        </w:tc>
+        <w:tc>
+          <w:tcPr>
+            <w:tcW w:w="3481" w:type="dxa"/>
+            <w:tcBorders>
+              <w:left w:val="single" w:sz="2" w:space="0" w:color="BFC7D5"/>
+              <w:bottom w:val="single" w:sz="2" w:space="0" w:color="BFC7D5"/>
+              <w:right w:val="single" w:sz="6" w:space="0" w:color="BFC7D5"/>
+            </w:tcBorders>
+            <w:vAlign w:val="center"/>
+          </w:tcPr>
+          <w:p>
+            <w:pPr>
+              <w:pStyle w:val="TableContents"/>
+              <w:bidi w:val="0"/>
+              <w:spacing w:before="0" w:after="283"/>
+              <w:jc w:val="left"/>
+              <w:rPr/>
+            </w:pPr>
+            <w:r>
+              <w:rPr/>
+              <w:t>Who may use generated text and images, and on what terms?</w:t>
+            </w:r>
+          </w:p>
+        </w:tc>
+      </w:tr>
+      <w:tr>
+        <w:trPr/>
+        <w:tc>
+          <w:tcPr>
+            <w:tcW w:w="1726" w:type="dxa"/>
+            <w:tcBorders>
+              <w:left w:val="single" w:sz="6" w:space="0" w:color="BFC7D5"/>
+              <w:bottom w:val="single" w:sz="2" w:space="0" w:color="BFC7D5"/>
+              <w:right w:val="single" w:sz="6" w:space="0" w:color="BFC7D5"/>
+            </w:tcBorders>
+            <w:vAlign w:val="center"/>
+          </w:tcPr>
+          <w:p>
+            <w:pPr>
+              <w:pStyle w:val="TableContents"/>
+              <w:bidi w:val="0"/>
+              <w:spacing w:before="0" w:after="283"/>
+              <w:jc w:val="left"/>
+              <w:rPr/>
+            </w:pPr>
+            <w:r>
+              <w:rPr/>
+              <w:t>Environmental impact</w:t>
+            </w:r>
+          </w:p>
+        </w:tc>
+        <w:tc>
+          <w:tcPr>
+            <w:tcW w:w="3481" w:type="dxa"/>
+            <w:tcBorders>
+              <w:left w:val="single" w:sz="2" w:space="0" w:color="BFC7D5"/>
+              <w:bottom w:val="single" w:sz="2" w:space="0" w:color="BFC7D5"/>
+              <w:right w:val="single" w:sz="6" w:space="0" w:color="BFC7D5"/>
+            </w:tcBorders>
+            <w:vAlign w:val="center"/>
+          </w:tcPr>
+          <w:p>
+            <w:pPr>
+              <w:pStyle w:val="TableContents"/>
+              <w:bidi w:val="0"/>
+              <w:spacing w:before="0" w:after="283"/>
+              <w:jc w:val="left"/>
+              <w:rPr/>
+            </w:pPr>
+            <w:r>
+              <w:rPr/>
+              <w:t>Energy and hardware use</w:t>
+            </w:r>
+          </w:p>
+        </w:tc>
+      </w:tr>
+      <w:tr>
+        <w:trPr/>
+        <w:tc>
+          <w:tcPr>
+            <w:tcW w:w="1726" w:type="dxa"/>
+            <w:tcBorders>
+              <w:left w:val="single" w:sz="6" w:space="0" w:color="BFC7D5"/>
+              <w:bottom w:val="single" w:sz="2" w:space="0" w:color="BFC7D5"/>
+              <w:right w:val="single" w:sz="6" w:space="0" w:color="BFC7D5"/>
+            </w:tcBorders>
+            <w:vAlign w:val="center"/>
+          </w:tcPr>
+          <w:p>
+            <w:pPr>
+              <w:pStyle w:val="TableContents"/>
+              <w:bidi w:val="0"/>
+              <w:spacing w:before="0" w:after="283"/>
+              <w:jc w:val="left"/>
+              <w:rPr/>
+            </w:pPr>
+            <w:r>
+              <w:rPr/>
+              <w:t>Accessibility</w:t>
+            </w:r>
+          </w:p>
+        </w:tc>
+        <w:tc>
+          <w:tcPr>
+            <w:tcW w:w="3481" w:type="dxa"/>
+            <w:tcBorders>
+              <w:left w:val="single" w:sz="2" w:space="0" w:color="BFC7D5"/>
+              <w:bottom w:val="single" w:sz="2" w:space="0" w:color="BFC7D5"/>
+              <w:right w:val="single" w:sz="6" w:space="0" w:color="BFC7D5"/>
+            </w:tcBorders>
+            <w:vAlign w:val="center"/>
+          </w:tcPr>
+          <w:p>
+            <w:pPr>
+              <w:pStyle w:val="TableContents"/>
+              <w:bidi w:val="0"/>
+              <w:spacing w:before="0" w:after="283"/>
+              <w:jc w:val="left"/>
+              <w:rPr/>
+            </w:pPr>
+            <w:r>
+              <w:rPr/>
+              <w:t>Can every feature be used without voice or without hearing?</w:t>
+            </w:r>
+          </w:p>
+        </w:tc>
+      </w:tr>
+      <w:tr>
+        <w:trPr/>
+        <w:tc>
+          <w:tcPr>
+            <w:tcW w:w="1726" w:type="dxa"/>
+            <w:tcBorders>
+              <w:left w:val="single" w:sz="6" w:space="0" w:color="BFC7D5"/>
+              <w:bottom w:val="single" w:sz="6" w:space="0" w:color="BFC7D5"/>
+              <w:right w:val="single" w:sz="6" w:space="0" w:color="BFC7D5"/>
+            </w:tcBorders>
+            <w:vAlign w:val="center"/>
+          </w:tcPr>
+          <w:p>
+            <w:pPr>
+              <w:pStyle w:val="TableContents"/>
+              <w:bidi w:val="0"/>
+              <w:spacing w:before="0" w:after="283"/>
+              <w:jc w:val="left"/>
+              <w:rPr/>
+            </w:pPr>
+            <w:r>
+              <w:rPr/>
+              <w:t>Governance</w:t>
+            </w:r>
+          </w:p>
+        </w:tc>
+        <w:tc>
+          <w:tcPr>
+            <w:tcW w:w="3481" w:type="dxa"/>
+            <w:tcBorders>
+              <w:left w:val="single" w:sz="2" w:space="0" w:color="BFC7D5"/>
+              <w:bottom w:val="single" w:sz="6" w:space="0" w:color="BFC7D5"/>
+              <w:right w:val="single" w:sz="6" w:space="0" w:color="BFC7D5"/>
+            </w:tcBorders>
+            <w:vAlign w:val="center"/>
+          </w:tcPr>
+          <w:p>
+            <w:pPr>
+              <w:pStyle w:val="TableContents"/>
+              <w:bidi w:val="0"/>
+              <w:spacing w:before="0" w:after="283"/>
+              <w:jc w:val="left"/>
+              <w:rPr/>
+            </w:pPr>
+            <w:r>
+              <w:rPr/>
+              <w:t>Who is accountable, and how is AI-assisted development controlled (§7)?</w:t>
+            </w:r>
+          </w:p>
+        </w:tc>
+      </w:tr>
+    </w:tbl>
+    <w:p>
+      <w:pPr>
+        <w:pStyle w:val="BodyText"/>
+        <w:bidi w:val="0"/>
+        <w:jc w:val="left"/>
+        <w:rPr/>
+      </w:pPr>
+      <w:r>
+        <w:rPr>
+          <w:rStyle w:val="Strong"/>
+        </w:rPr>
+        <w:t>Who.</w:t>
+      </w:r>
+      <w:r>
+        <w:rPr/>
+        <w:t xml:space="preserve"> Prepared by the Lead Engineer; reviewed by the EchoMind Project Lead (client, user and ethical impact) and the data custodian (data protection and consent); approved by the Managing Director. ISO/IEC 42001 and ISO/IEC 23894 are used as guidance.</w:t>
+      </w:r>
+    </w:p>
+    <w:p>
+      <w:pPr>
+        <w:pStyle w:val="BodyText"/>
+        <w:bidi w:val="0"/>
+        <w:jc w:val="left"/>
+        <w:rPr/>
+      </w:pPr>
+      <w:r>
+        <w:rPr>
+          <w:rStyle w:val="Strong"/>
+        </w:rPr>
+        <w:t>Where.</w:t>
+      </w:r>
+      <w:r>
+        <w:rPr/>
+        <w:t xml:space="preserve"> </w:t>
+      </w:r>
+      <w:r>
+        <w:rPr>
+          <w:rStyle w:val="SourceText"/>
+        </w:rPr>
+        <w:t>evidence-2026/20_AI_Impact_Assessment/EM26-35_AI_Impact_Assessment_EchoMind.docx</w:t>
+      </w:r>
+      <w:r>
+        <w:rPr/>
+        <w:t xml:space="preserve">. High and medium impacts that remain after controls are carried as risks in </w:t>
+      </w:r>
+      <w:r>
+        <w:rPr>
+          <w:rStyle w:val="SourceText"/>
+        </w:rPr>
+        <w:t>REG-03</w:t>
+      </w:r>
+      <w:r>
+        <w:rPr/>
+        <w:t xml:space="preserve">; actions are tracked to closure there and in </w:t>
+      </w:r>
+      <w:r>
+        <w:rPr>
+          <w:rStyle w:val="SourceText"/>
+        </w:rPr>
+        <w:t>REG-04</w:t>
+      </w:r>
+      <w:r>
+        <w:rPr/>
+        <w:t xml:space="preserve"> where they arise from an audit finding.</w:t>
+      </w:r>
+    </w:p>
+    <w:p>
+      <w:pPr>
+        <w:pStyle w:val="Heading2"/>
+        <w:bidi w:val="0"/>
+        <w:jc w:val="left"/>
+        <w:rPr/>
+      </w:pPr>
+      <w:r>
+        <w:rPr/>
         <w:t>8. Design and development outputs (8.3.5)</w:t>
       </w:r>
     </w:p>
@@ -7859,6 +9156,91 @@
             <w:tcW w:w="1837" w:type="dxa"/>
             <w:tcBorders>
               <w:left w:val="single" w:sz="6" w:space="0" w:color="BFC7D5"/>
+              <w:bottom w:val="single" w:sz="2" w:space="0" w:color="BFC7D5"/>
+              <w:right w:val="single" w:sz="6" w:space="0" w:color="BFC7D5"/>
+            </w:tcBorders>
+            <w:vAlign w:val="center"/>
+          </w:tcPr>
+          <w:p>
+            <w:pPr>
+              <w:pStyle w:val="TableContents"/>
+              <w:bidi w:val="0"/>
+              <w:spacing w:before="0" w:after="283"/>
+              <w:jc w:val="left"/>
+              <w:rPr/>
+            </w:pPr>
+            <w:r>
+              <w:rPr/>
+              <w:t>Customer acceptance against agreed criteria</w:t>
+            </w:r>
+          </w:p>
+        </w:tc>
+        <w:tc>
+          <w:tcPr>
+            <w:tcW w:w="1967" w:type="dxa"/>
+            <w:tcBorders>
+              <w:left w:val="single" w:sz="2" w:space="0" w:color="BFC7D5"/>
+              <w:bottom w:val="single" w:sz="2" w:space="0" w:color="BFC7D5"/>
+              <w:right w:val="single" w:sz="6" w:space="0" w:color="BFC7D5"/>
+            </w:tcBorders>
+            <w:vAlign w:val="center"/>
+          </w:tcPr>
+          <w:p>
+            <w:pPr>
+              <w:pStyle w:val="TableContents"/>
+              <w:bidi w:val="0"/>
+              <w:spacing w:before="0" w:after="283"/>
+              <w:jc w:val="left"/>
+              <w:rPr/>
+            </w:pPr>
+            <w:r>
+              <w:rPr/>
+              <w:t xml:space="preserve">Filed under </w:t>
+            </w:r>
+            <w:r>
+              <w:rPr>
+                <w:rStyle w:val="SourceText"/>
+              </w:rPr>
+              <w:t>SOP-04</w:t>
+            </w:r>
+            <w:r>
+              <w:rPr/>
+              <w:t xml:space="preserve"> §10</w:t>
+            </w:r>
+          </w:p>
+        </w:tc>
+        <w:tc>
+          <w:tcPr>
+            <w:tcW w:w="1403" w:type="dxa"/>
+            <w:tcBorders>
+              <w:left w:val="single" w:sz="2" w:space="0" w:color="BFC7D5"/>
+              <w:bottom w:val="single" w:sz="2" w:space="0" w:color="BFC7D5"/>
+              <w:right w:val="single" w:sz="6" w:space="0" w:color="BFC7D5"/>
+            </w:tcBorders>
+            <w:vAlign w:val="center"/>
+          </w:tcPr>
+          <w:p>
+            <w:pPr>
+              <w:pStyle w:val="TableContents"/>
+              <w:bidi w:val="0"/>
+              <w:spacing w:before="0" w:after="283"/>
+              <w:jc w:val="left"/>
+              <w:rPr/>
+            </w:pPr>
+            <w:r>
+              <w:rPr/>
+              <w:t>3 years after the engagement ends</w:t>
+            </w:r>
+          </w:p>
+        </w:tc>
+      </w:tr>
+      <w:tr>
+        <w:trPr/>
+        <w:tc>
+          <w:tcPr>
+            <w:tcW w:w="1837" w:type="dxa"/>
+            <w:tcBorders>
+              <w:left w:val="single" w:sz="6" w:space="0" w:color="BFC7D5"/>
               <w:bottom w:val="single" w:sz="6" w:space="0" w:color="BFC7D5"/>
               <w:right w:val="single" w:sz="6" w:space="0" w:color="BFC7D5"/>
             </w:tcBorders>
@@ -7874,7 +9256,7 @@
             </w:pPr>
             <w:r>
               <w:rPr/>
-              <w:t>Customer acceptance against agreed criteria</w:t>
+              <w:t>AI impact assessment (§7a)</w:t>
             </w:r>
           </w:p>
         </w:tc>
@@ -7897,18 +9279,14 @@
               <w:rPr/>
             </w:pPr>
             <w:r>
-              <w:rPr/>
-              <w:t xml:space="preserve">Filed under </w:t>
-            </w:r>
-            <w:r>
               <w:rPr>
                 <w:rStyle w:val="SourceText"/>
               </w:rPr>
-              <w:t>SOP-04</w:t>
-            </w:r>
-            <w:r>
-              <w:rPr/>
-              <w:t xml:space="preserve"> §10</w:t>
+              <w:t>evidence-2026/20_AI_Impact_Assessment/</w:t>
+            </w:r>
+            <w:r>
+              <w:rPr/>
+              <w:t xml:space="preserve"> — EM26-35 and its revisions</w:t>
             </w:r>
           </w:p>
         </w:tc>
@@ -7932,7 +9310,7 @@
             </w:pPr>
             <w:r>
               <w:rPr/>
-              <w:t>3 years after the engagement ends</w:t>
+              <w:t>Life of the product release + 3 years</w:t>
             </w:r>
           </w:p>
         </w:tc>
@@ -9846,6 +11224,125 @@
   <w:abstractNum w:abstractNumId="4">
     <w:lvl w:ilvl="0">
       <w:start w:val="1"/>
+      <w:numFmt w:val="decimal"/>
+      <w:lvlText w:val="%1."/>
+      <w:lvlJc w:val="left"/>
+      <w:pPr>
+        <w:tabs>
+          <w:tab w:val="num" w:pos="709"/>
+        </w:tabs>
+        <w:ind w:left="709" w:hanging="283"/>
+      </w:pPr>
+      <w:rPr/>
+    </w:lvl>
+    <w:lvl w:ilvl="1">
+      <w:start w:val="1"/>
+      <w:numFmt w:val="decimal"/>
+      <w:lvlText w:val="%2."/>
+      <w:lvlJc w:val="left"/>
+      <w:pPr>
+        <w:tabs>
+          <w:tab w:val="num" w:pos="1418"/>
+        </w:tabs>
+        <w:ind w:left="1418" w:hanging="283"/>
+      </w:pPr>
+      <w:rPr/>
+    </w:lvl>
+    <w:lvl w:ilvl="2">
+      <w:start w:val="1"/>
+      <w:numFmt w:val="decimal"/>
+      <w:lvlText w:val="%3."/>
+      <w:lvlJc w:val="left"/>
+      <w:pPr>
+        <w:tabs>
+          <w:tab w:val="num" w:pos="2127"/>
+        </w:tabs>
+        <w:ind w:left="2127" w:hanging="283"/>
+      </w:pPr>
+      <w:rPr/>
+    </w:lvl>
+    <w:lvl w:ilvl="3">
+      <w:start w:val="1"/>
+      <w:numFmt w:val="decimal"/>
+      <w:lvlText w:val="%4."/>
+      <w:lvlJc w:val="left"/>
+      <w:pPr>
+        <w:tabs>
+          <w:tab w:val="num" w:pos="2836"/>
+        </w:tabs>
+        <w:ind w:left="2836" w:hanging="283"/>
+      </w:pPr>
+      <w:rPr/>
+    </w:lvl>
+    <w:lvl w:ilvl="4">
+      <w:start w:val="1"/>
+      <w:numFmt w:val="decimal"/>
+      <w:lvlText w:val="%5."/>
+      <w:lvlJc w:val="left"/>
+      <w:pPr>
+        <w:tabs>
+          <w:tab w:val="num" w:pos="3545"/>
+        </w:tabs>
+        <w:ind w:left="3545" w:hanging="283"/>
+      </w:pPr>
+      <w:rPr/>
+    </w:lvl>
+    <w:lvl w:ilvl="5">
+      <w:start w:val="1"/>
+      <w:numFmt w:val="decimal"/>
+      <w:lvlText w:val="%6."/>
+      <w:lvlJc w:val="left"/>
+      <w:pPr>
+        <w:tabs>
+          <w:tab w:val="num" w:pos="4254"/>
+        </w:tabs>
+        <w:ind w:left="4254" w:hanging="283"/>
+      </w:pPr>
+      <w:rPr/>
+    </w:lvl>
+    <w:lvl w:ilvl="6">
+      <w:start w:val="1"/>
+      <w:numFmt w:val="decimal"/>
+      <w:lvlText w:val="%7."/>
+      <w:lvlJc w:val="left"/>
+      <w:pPr>
+        <w:tabs>
+          <w:tab w:val="num" w:pos="4963"/>
+        </w:tabs>
+        <w:ind w:left="4963" w:hanging="283"/>
+      </w:pPr>
+      <w:rPr/>
+    </w:lvl>
+    <w:lvl w:ilvl="7">
+      <w:start w:val="1"/>
+      <w:numFmt w:val="decimal"/>
+      <w:lvlText w:val="%8."/>
+      <w:lvlJc w:val="left"/>
+      <w:pPr>
+        <w:tabs>
+          <w:tab w:val="num" w:pos="5672"/>
+        </w:tabs>
+        <w:ind w:left="5672" w:hanging="283"/>
+      </w:pPr>
+      <w:rPr/>
+    </w:lvl>
+    <w:lvl w:ilvl="8">
+      <w:start w:val="1"/>
+      <w:numFmt w:val="decimal"/>
+      <w:lvlText w:val="%9."/>
+      <w:lvlJc w:val="left"/>
+      <w:pPr>
+        <w:tabs>
+          <w:tab w:val="num" w:pos="6381"/>
+        </w:tabs>
+        <w:ind w:left="6381" w:hanging="283"/>
+      </w:pPr>
+      <w:rPr/>
+    </w:lvl>
+  </w:abstractNum>
+  <w:abstractNum w:abstractNumId="5">
+    <w:lvl w:ilvl="0">
+      <w:start w:val="1"/>
       <w:numFmt w:val="none"/>
       <w:suff w:val="nothing"/>
       <w:lvlText w:val="%1"/>
@@ -9975,6 +11472,9 @@
   </w:num>
   <w:num w:numId="4">
     <w:abstractNumId w:val="4"/>
+  </w:num>
+  <w:num w:numId="5">
+    <w:abstractNumId w:val="5"/>
   </w:num>
 </w:numbering>
 </file>
@@ -10092,19 +11592,19 @@
       <w:bCs/>
     </w:rPr>
   </w:style>
-  <w:style w:type="character" w:styleId="Bullets">
-    <w:name w:val="Bullets"/>
-    <w:qFormat/>
-    <w:rPr>
-      <w:rFonts w:ascii="OpenSymbol" w:hAnsi="OpenSymbol" w:eastAsia="OpenSymbol" w:cs="OpenSymbol"/>
-    </w:rPr>
-  </w:style>
   <w:style w:type="character" w:styleId="Emphasis">
     <w:name w:val="Emphasis"/>
     <w:qFormat/>
     <w:rPr>
       <w:i/>
       <w:iCs/>
+    </w:rPr>
+  </w:style>
+  <w:style w:type="character" w:styleId="Bullets">
+    <w:name w:val="Bullets"/>
+    <w:qFormat/>
+    <w:rPr>
+      <w:rFonts w:ascii="OpenSymbol" w:hAnsi="OpenSymbol" w:eastAsia="OpenSymbol" w:cs="OpenSymbol"/>
     </w:rPr>
   </w:style>
   <w:style w:type="character" w:styleId="NumberingSymbols">

</xml_diff>